<commit_message>
#1111 - runtime: close temp streams
</commit_message>
<xml_diff>
--- a/doc/refcards/core-ref.docx
+++ b/doc/refcards/core-ref.docx
@@ -1,6 +1,6 @@
 
 <file path=word/document.xml><?xml version="1.0" encoding="utf-8"?>
-<w:document xmlns:o="urn:schemas-microsoft-com:office:office" xmlns:r="http://schemas.openxmlformats.org/officeDocument/2006/relationships" xmlns:v="urn:schemas-microsoft-com:vml" xmlns:w="http://schemas.openxmlformats.org/wordprocessingml/2006/main" xmlns:w10="urn:schemas-microsoft-com:office:word" xmlns:wp="http://schemas.openxmlformats.org/drawingml/2006/wordprocessingDrawing" xmlns:wps="http://schemas.microsoft.com/office/word/2010/wordprocessingShape" xmlns:wpg="http://schemas.microsoft.com/office/word/2010/wordprocessingGroup" xmlns:mc="http://schemas.openxmlformats.org/markup-compatibility/2006" xmlns:wp14="http://schemas.microsoft.com/office/word/2010/wordprocessingDrawing" xmlns:w14="http://schemas.microsoft.com/office/word/2010/wordml" xmlns:w15="http://schemas.microsoft.com/office/word/2012/wordml" mc:Ignorable="w14 wp14 w15">
+<w:document xmlns:o="urn:schemas-microsoft-com:office:office" xmlns:r="http://schemas.openxmlformats.org/officeDocument/2006/relationships" xmlns:v="urn:schemas-microsoft-com:vml" xmlns:w="http://schemas.openxmlformats.org/wordprocessingml/2006/main" xmlns:w10="urn:schemas-microsoft-com:office:word" xmlns:wp="http://schemas.openxmlformats.org/drawingml/2006/wordprocessingDrawing" xmlns:pic="http://schemas.openxmlformats.org/drawingml/2006/picture" xmlns:wps="http://schemas.microsoft.com/office/word/2010/wordprocessingShape" xmlns:wpg="http://schemas.microsoft.com/office/word/2010/wordprocessingGroup" xmlns:mc="http://schemas.openxmlformats.org/markup-compatibility/2006" xmlns:wp14="http://schemas.microsoft.com/office/word/2010/wordprocessingDrawing" xmlns:w14="http://schemas.microsoft.com/office/word/2010/wordml" xmlns:w15="http://schemas.microsoft.com/office/word/2012/wordml" mc:Ignorable="w14 wp14 w15">
   <w:body>
     <w:p>
       <w:pPr>
@@ -9,7 +9,6 @@
           <w:rFonts w:ascii="Georgia" w:hAnsi="Georgia"/>
           <w:b w:val="false"/>
           <w:bCs w:val="false"/>
-          <w:i w:val="false"/>
           <w:i w:val="false"/>
           <w:iCs w:val="false"/>
           <w:sz w:val="16"/>
@@ -37,7 +36,6 @@
           <w:rFonts w:ascii="Georgia" w:hAnsi="Georgia"/>
           <w:b w:val="false"/>
           <w:bCs w:val="false"/>
-          <w:i w:val="false"/>
           <w:i w:val="false"/>
           <w:iCs w:val="false"/>
           <w:sz w:val="16"/>
@@ -66,11 +64,11 @@
           <w:tab w:val="left" w:pos="4110" w:leader="none"/>
         </w:tabs>
         <w:suppressAutoHyphens w:val="true"/>
-        <w:overflowPunct w:val="false"/>
+        <w:overflowPunct w:val="true"/>
         <w:bidi w:val="0"/>
         <w:spacing w:before="0" w:after="0"/>
-        <w:ind w:hanging="0" w:start="0" w:end="0"/>
-        <w:jc w:val="start"/>
+        <w:ind w:hanging="0" w:left="0" w:right="0"/>
+        <w:jc w:val="left"/>
         <w:rPr>
           <w:sz w:val="32"/>
           <w:szCs w:val="32"/>
@@ -202,35 +200,7 @@
           <w:u w:val="none"/>
           <w:shd w:fill="333333" w:val="clear"/>
         </w:rPr>
-        <w:t xml:space="preserve">   </w:t>
-      </w:r>
-      <w:r>
-        <w:rPr>
-          <w:rFonts w:ascii="Georgia" w:hAnsi="Georgia"/>
-          <w:b/>
-          <w:bCs/>
-          <w:i/>
-          <w:iCs/>
-          <w:sz w:val="32"/>
-          <w:szCs w:val="32"/>
-          <w:u w:val="none"/>
-          <w:shd w:fill="333333" w:val="clear"/>
-        </w:rPr>
-        <w:t>            </w:t>
-      </w:r>
-      <w:r>
-        <w:rPr>
-          <w:rFonts w:ascii="Georgia" w:hAnsi="Georgia"/>
-          <w:b w:val="false"/>
-          <w:bCs/>
-          <w:i w:val="false"/>
-          <w:iCs/>
-          <w:sz w:val="32"/>
-          <w:szCs w:val="32"/>
-          <w:u w:val="none"/>
-          <w:shd w:fill="333333" w:val="clear"/>
-        </w:rPr>
-        <w:t xml:space="preserve">  </w:t>
+        <w:t xml:space="preserve">    </w:t>
       </w:r>
       <w:r>
         <w:rPr>
@@ -421,21 +391,7 @@
           <w:u w:val="none"/>
           <w:shd w:fill="333333" w:val="clear"/>
         </w:rPr>
-        <w:t xml:space="preserve">                     </w:t>
-      </w:r>
-      <w:r>
-        <w:rPr>
-          <w:rFonts w:ascii="Georgia" w:hAnsi="Georgia"/>
-          <w:b w:val="false"/>
-          <w:bCs/>
-          <w:i w:val="false"/>
-          <w:iCs/>
-          <w:sz w:val="22"/>
-          <w:szCs w:val="22"/>
-          <w:u w:val="none"/>
-          <w:shd w:fill="333333" w:val="clear"/>
-        </w:rPr>
-        <w:t xml:space="preserve"> </w:t>
+        <w:t xml:space="preserve">            </w:t>
       </w:r>
       <w:r>
         <w:rPr>
@@ -472,7 +428,7 @@
     <w:p>
       <w:pPr>
         <w:pStyle w:val="Normal"/>
-        <w:ind w:hanging="0" w:start="0" w:end="0"/>
+        <w:ind w:hanging="0" w:left="0" w:right="0"/>
         <w:rPr>
           <w:sz w:val="18"/>
           <w:szCs w:val="18"/>
@@ -523,7 +479,7 @@
       <w:pPr>
         <w:pStyle w:val="Normal"/>
         <w:bidi w:val="0"/>
-        <w:jc w:val="start"/>
+        <w:jc w:val="left"/>
         <w:rPr>
           <w:sz w:val="18"/>
           <w:szCs w:val="18"/>
@@ -562,7 +518,7 @@
       <w:pPr>
         <w:pStyle w:val="Normal"/>
         <w:bidi w:val="0"/>
-        <w:jc w:val="start"/>
+        <w:jc w:val="left"/>
         <w:rPr>
           <w:sz w:val="18"/>
           <w:szCs w:val="18"/>
@@ -599,7 +555,7 @@
     <w:p>
       <w:pPr>
         <w:pStyle w:val="Normal"/>
-        <w:ind w:hanging="0" w:start="0" w:end="0"/>
+        <w:ind w:hanging="0" w:left="0" w:right="0"/>
         <w:rPr>
           <w:sz w:val="18"/>
           <w:szCs w:val="18"/>
@@ -649,23 +605,23 @@
     <w:p>
       <w:pPr>
         <w:pStyle w:val="Normal"/>
-        <w:ind w:hanging="0" w:start="0" w:end="0"/>
-        <w:rPr>
-          <w:sz w:val="12"/>
-          <w:szCs w:val="12"/>
-        </w:rPr>
-      </w:pPr>
-      <w:r>
-        <w:rPr>
-          <w:sz w:val="12"/>
-          <w:szCs w:val="12"/>
-        </w:rPr>
-      </w:r>
-    </w:p>
-    <w:p>
-      <w:pPr>
-        <w:pStyle w:val="Normal"/>
-        <w:ind w:hanging="0" w:start="0" w:end="0"/>
+        <w:ind w:hanging="0" w:left="0" w:right="0"/>
+        <w:rPr>
+          <w:sz w:val="12"/>
+          <w:szCs w:val="12"/>
+        </w:rPr>
+      </w:pPr>
+      <w:r>
+        <w:rPr>
+          <w:sz w:val="12"/>
+          <w:szCs w:val="12"/>
+        </w:rPr>
+      </w:r>
+    </w:p>
+    <w:p>
+      <w:pPr>
+        <w:pStyle w:val="Normal"/>
+        <w:ind w:hanging="0" w:left="0" w:right="0"/>
         <w:rPr>
           <w:sz w:val="18"/>
           <w:szCs w:val="18"/>
@@ -725,7 +681,7 @@
     <w:p>
       <w:pPr>
         <w:pStyle w:val="Normal"/>
-        <w:ind w:hanging="0" w:start="0" w:end="0"/>
+        <w:ind w:hanging="0" w:left="0" w:right="0"/>
         <w:rPr>
           <w:sz w:val="18"/>
           <w:szCs w:val="18"/>
@@ -761,7 +717,7 @@
     <w:p>
       <w:pPr>
         <w:pStyle w:val="Normal"/>
-        <w:ind w:hanging="0" w:start="0" w:end="0"/>
+        <w:ind w:hanging="0" w:left="0" w:right="0"/>
         <w:rPr>
           <w:sz w:val="18"/>
           <w:szCs w:val="18"/>
@@ -797,7 +753,7 @@
     <w:p>
       <w:pPr>
         <w:pStyle w:val="Normal"/>
-        <w:ind w:hanging="0" w:start="0" w:end="0"/>
+        <w:ind w:hanging="0" w:left="0" w:right="0"/>
         <w:rPr>
           <w:sz w:val="18"/>
           <w:szCs w:val="18"/>
@@ -833,7 +789,7 @@
     <w:p>
       <w:pPr>
         <w:pStyle w:val="Normal"/>
-        <w:ind w:hanging="0" w:start="0" w:end="0"/>
+        <w:ind w:hanging="0" w:left="0" w:right="0"/>
         <w:rPr>
           <w:sz w:val="18"/>
           <w:szCs w:val="18"/>
@@ -873,7 +829,7 @@
     <w:p>
       <w:pPr>
         <w:pStyle w:val="Normal"/>
-        <w:ind w:hanging="0" w:start="0" w:end="0"/>
+        <w:ind w:hanging="0" w:left="0" w:right="0"/>
         <w:rPr>
           <w:sz w:val="18"/>
           <w:szCs w:val="18"/>
@@ -909,7 +865,7 @@
     <w:p>
       <w:pPr>
         <w:pStyle w:val="Normal"/>
-        <w:ind w:hanging="0" w:start="0" w:end="0"/>
+        <w:ind w:hanging="0" w:left="0" w:right="0"/>
         <w:rPr>
           <w:sz w:val="18"/>
           <w:szCs w:val="18"/>
@@ -948,7 +904,7 @@
     <w:p>
       <w:pPr>
         <w:pStyle w:val="Normal"/>
-        <w:ind w:hanging="0" w:start="0" w:end="0"/>
+        <w:ind w:hanging="0" w:left="0" w:right="0"/>
         <w:rPr>
           <w:sz w:val="18"/>
           <w:szCs w:val="18"/>
@@ -987,7 +943,7 @@
     <w:p>
       <w:pPr>
         <w:pStyle w:val="Normal"/>
-        <w:ind w:hanging="0" w:start="0" w:end="0"/>
+        <w:ind w:hanging="0" w:left="0" w:right="0"/>
         <w:rPr>
           <w:sz w:val="18"/>
           <w:szCs w:val="18"/>
@@ -1026,7 +982,7 @@
     <w:p>
       <w:pPr>
         <w:pStyle w:val="Normal"/>
-        <w:ind w:hanging="0" w:start="0" w:end="0"/>
+        <w:ind w:hanging="0" w:left="0" w:right="0"/>
         <w:rPr>
           <w:sz w:val="18"/>
           <w:szCs w:val="18"/>
@@ -1062,7 +1018,7 @@
     <w:p>
       <w:pPr>
         <w:pStyle w:val="Normal"/>
-        <w:ind w:hanging="0" w:start="0" w:end="0"/>
+        <w:ind w:hanging="0" w:left="0" w:right="0"/>
         <w:rPr>
           <w:sz w:val="18"/>
           <w:szCs w:val="18"/>
@@ -1098,7 +1054,7 @@
     <w:p>
       <w:pPr>
         <w:pStyle w:val="Normal"/>
-        <w:ind w:hanging="0" w:start="0" w:end="0"/>
+        <w:ind w:hanging="0" w:left="0" w:right="0"/>
         <w:rPr>
           <w:sz w:val="18"/>
           <w:szCs w:val="18"/>
@@ -1138,7 +1094,7 @@
     <w:p>
       <w:pPr>
         <w:pStyle w:val="Normal"/>
-        <w:ind w:hanging="0" w:start="0" w:end="0"/>
+        <w:ind w:hanging="0" w:left="0" w:right="0"/>
         <w:rPr>
           <w:sz w:val="18"/>
           <w:szCs w:val="18"/>
@@ -1174,7 +1130,7 @@
     <w:p>
       <w:pPr>
         <w:pStyle w:val="Normal"/>
-        <w:ind w:hanging="0" w:start="0" w:end="0"/>
+        <w:ind w:hanging="0" w:left="0" w:right="0"/>
         <w:rPr>
           <w:sz w:val="18"/>
           <w:szCs w:val="18"/>
@@ -1214,7 +1170,7 @@
     <w:p>
       <w:pPr>
         <w:pStyle w:val="Normal"/>
-        <w:ind w:hanging="0" w:start="0" w:end="0"/>
+        <w:ind w:hanging="0" w:left="0" w:right="0"/>
         <w:rPr>
           <w:sz w:val="18"/>
           <w:szCs w:val="18"/>
@@ -1254,7 +1210,7 @@
     <w:p>
       <w:pPr>
         <w:pStyle w:val="Normal"/>
-        <w:ind w:hanging="0" w:start="0" w:end="0"/>
+        <w:ind w:hanging="0" w:left="0" w:right="0"/>
         <w:rPr>
           <w:rFonts w:ascii="Georgia" w:hAnsi="Georgia"/>
           <w:sz w:val="12"/>
@@ -2399,23 +2355,6 @@
         <w:rPr>
           <w:sz w:val="18"/>
           <w:szCs w:val="18"/>
-        </w:rPr>
-      </w:r>
-    </w:p>
-    <w:p>
-      <w:pPr>
-        <w:pStyle w:val="Normal"/>
-        <w:rPr>
-          <w:rFonts w:ascii="Georgia" w:hAnsi="Georgia"/>
-          <w:sz w:val="16"/>
-          <w:szCs w:val="16"/>
-        </w:rPr>
-      </w:pPr>
-      <w:r>
-        <w:rPr>
-          <w:rFonts w:ascii="Georgia" w:hAnsi="Georgia"/>
-          <w:sz w:val="16"/>
-          <w:szCs w:val="16"/>
         </w:rPr>
       </w:r>
     </w:p>
@@ -3214,7 +3153,6 @@
           <w:rFonts w:ascii="Georgia" w:hAnsi="Georgia"/>
           <w:b w:val="false"/>
           <w:i/>
-          <w:i/>
           <w:iCs/>
           <w:sz w:val="12"/>
           <w:szCs w:val="12"/>
@@ -5139,7 +5077,6 @@
         <w:rPr>
           <w:rFonts w:ascii="Georgia" w:hAnsi="Georgia"/>
           <w:b w:val="false"/>
-          <w:i w:val="false"/>
           <w:i w:val="false"/>
           <w:iCs w:val="false"/>
           <w:sz w:val="12"/>
@@ -9361,6 +9298,22 @@
           <w:rFonts w:eastAsia="Songti SC" w:cs="Arial Unicode MS" w:ascii="Georgia" w:hAnsi="Georgia"/>
           <w:b/>
           <w:bCs/>
+          <w:i w:val="false"/>
+          <w:iCs w:val="false"/>
+          <w:color w:val="auto"/>
+          <w:kern w:val="2"/>
+          <w:sz w:val="18"/>
+          <w:szCs w:val="18"/>
+          <w:u w:val="none"/>
+          <w:lang w:val="en-US" w:eastAsia="zh-CN" w:bidi="hi-IN"/>
+        </w:rPr>
+        <w:t>%</w:t>
+      </w:r>
+      <w:r>
+        <w:rPr>
+          <w:rFonts w:eastAsia="Songti SC" w:cs="Arial Unicode MS" w:ascii="Georgia" w:hAnsi="Georgia"/>
+          <w:b/>
+          <w:bCs/>
           <w:i/>
           <w:iCs/>
           <w:color w:val="auto"/>
@@ -13105,19 +13058,6 @@
       <w:r>
         <w:rPr>
           <w:rFonts w:ascii="Georgia" w:hAnsi="Georgia"/>
-          <w:b/>
-          <w:bCs/>
-          <w:i/>
-          <w:iCs/>
-          <w:sz w:val="20"/>
-          <w:szCs w:val="20"/>
-          <w:shd w:fill="333333" w:val="clear"/>
-        </w:rPr>
-        <w:t>           </w:t>
-      </w:r>
-      <w:r>
-        <w:rPr>
-          <w:rFonts w:ascii="Georgia" w:hAnsi="Georgia"/>
           <w:b w:val="false"/>
           <w:bCs/>
           <w:i w:val="false"/>
@@ -13126,13 +13066,13 @@
           <w:szCs w:val="20"/>
           <w:shd w:fill="333333" w:val="clear"/>
         </w:rPr>
-        <w:t xml:space="preserve">     </w:t>
-      </w:r>
-    </w:p>
-    <w:p>
-      <w:pPr>
-        <w:pStyle w:val="Normal"/>
-        <w:ind w:hanging="0" w:start="0"/>
+        <w:t xml:space="preserve">    </w:t>
+      </w:r>
+    </w:p>
+    <w:p>
+      <w:pPr>
+        <w:pStyle w:val="Normal"/>
+        <w:ind w:hanging="0" w:left="0"/>
         <w:rPr>
           <w:rFonts w:ascii="Georgia" w:hAnsi="Georgia"/>
           <w:b w:val="false"/>
@@ -13154,15 +13094,14 @@
     <w:p>
       <w:pPr>
         <w:pStyle w:val="Normal"/>
-        <w:ind w:hanging="0" w:start="0"/>
-        <w:rPr>
-          <w:b w:val="false"/>
-          <w:bCs w:val="false"/>
-        </w:rPr>
-      </w:pPr>
-      <w:r>
-        <w:rPr>
-          <w:rFonts w:ascii="Andale Mono" w:hAnsi="Andale Mono"/>
+        <w:ind w:hanging="0" w:left="0"/>
+        <w:rPr>
+          <w:rFonts w:ascii="Andale Mono MT Std" w:hAnsi="Andale Mono MT Std"/>
+        </w:rPr>
+      </w:pPr>
+      <w:r>
+        <w:rPr>
+          <w:rFonts w:ascii="Andale Mono MT Std" w:hAnsi="Andale Mono MT Std"/>
           <w:b w:val="false"/>
           <w:bCs w:val="false"/>
           <w:i w:val="false"/>
@@ -13178,7 +13117,7 @@
       </w:r>
       <w:r>
         <w:rPr>
-          <w:rFonts w:ascii="Andale Mono" w:hAnsi="Andale Mono"/>
+          <w:rFonts w:ascii="Andale Mono MT Std" w:hAnsi="Andale Mono MT Std"/>
           <w:b w:val="false"/>
           <w:bCs w:val="false"/>
           <w:i w:val="false"/>
@@ -13193,10 +13132,20 @@
         <w:t>;</w:t>
         <w:tab/>
         <w:tab/>
-      </w:r>
-      <w:r>
-        <w:rPr>
-          <w:rFonts w:ascii="Georgia" w:hAnsi="Georgia"/>
+        <w:t>comment to end of line</w:t>
+      </w:r>
+    </w:p>
+    <w:p>
+      <w:pPr>
+        <w:pStyle w:val="Normal"/>
+        <w:ind w:hanging="0" w:left="0"/>
+        <w:rPr>
+          <w:rFonts w:ascii="Andale Mono MT Std" w:hAnsi="Andale Mono MT Std"/>
+        </w:rPr>
+      </w:pPr>
+      <w:r>
+        <w:rPr>
+          <w:rFonts w:ascii="Andale Mono MT Std" w:hAnsi="Andale Mono MT Std"/>
           <w:b w:val="false"/>
           <w:bCs w:val="false"/>
           <w:i w:val="false"/>
@@ -13208,21 +13157,11 @@
           <w:sz w:val="16"/>
           <w:szCs w:val="16"/>
         </w:rPr>
-        <w:t>comment to end of line</w:t>
-      </w:r>
-    </w:p>
-    <w:p>
-      <w:pPr>
-        <w:pStyle w:val="Normal"/>
-        <w:ind w:hanging="0" w:start="0"/>
-        <w:rPr>
-          <w:b w:val="false"/>
-          <w:bCs w:val="false"/>
-        </w:rPr>
-      </w:pPr>
-      <w:r>
-        <w:rPr>
-          <w:rFonts w:ascii="Andale Mono" w:hAnsi="Andale Mono"/>
+        <w:t xml:space="preserve"> </w:t>
+      </w:r>
+      <w:r>
+        <w:rPr>
+          <w:rFonts w:ascii="Andale Mono MT Std" w:hAnsi="Andale Mono MT Std"/>
           <w:b w:val="false"/>
           <w:bCs w:val="false"/>
           <w:i w:val="false"/>
@@ -13234,11 +13173,44 @@
           <w:sz w:val="16"/>
           <w:szCs w:val="16"/>
         </w:rPr>
-        <w:t xml:space="preserve"> </w:t>
-      </w:r>
-      <w:r>
-        <w:rPr>
-          <w:rFonts w:ascii="Andale Mono" w:hAnsi="Andale Mono"/>
+        <w:t>#|...|#</w:t>
+        <w:tab/>
+        <w:t>block comment</w:t>
+      </w:r>
+    </w:p>
+    <w:p>
+      <w:pPr>
+        <w:pStyle w:val="Normal"/>
+        <w:ind w:hanging="0" w:left="0"/>
+        <w:rPr>
+          <w:rFonts w:ascii="Andale Mono MT Std" w:hAnsi="Andale Mono MT Std"/>
+          <w:b w:val="false"/>
+          <w:bCs w:val="false"/>
+          <w:sz w:val="16"/>
+          <w:szCs w:val="16"/>
+        </w:rPr>
+      </w:pPr>
+      <w:r>
+        <w:rPr>
+          <w:rFonts w:ascii="Andale Mono MT Std" w:hAnsi="Andale Mono MT Std"/>
+          <w:b w:val="false"/>
+          <w:bCs w:val="false"/>
+          <w:sz w:val="16"/>
+          <w:szCs w:val="16"/>
+        </w:rPr>
+      </w:r>
+    </w:p>
+    <w:p>
+      <w:pPr>
+        <w:pStyle w:val="Normal"/>
+        <w:ind w:hanging="0" w:left="0"/>
+        <w:rPr>
+          <w:rFonts w:ascii="Andale Mono MT Std" w:hAnsi="Andale Mono MT Std"/>
+        </w:rPr>
+      </w:pPr>
+      <w:r>
+        <w:rPr>
+          <w:rFonts w:ascii="Andale Mono MT Std" w:hAnsi="Andale Mono MT Std"/>
           <w:b w:val="false"/>
           <w:bCs w:val="false"/>
           <w:i w:val="false"/>
@@ -13250,16 +13222,15 @@
           <w:sz w:val="16"/>
           <w:szCs w:val="16"/>
         </w:rPr>
-        <w:t>#|...|#</w:t>
-        <w:tab/>
-      </w:r>
-      <w:r>
-        <w:rPr>
-          <w:rFonts w:ascii="Georgia" w:hAnsi="Georgia"/>
-          <w:b w:val="false"/>
-          <w:bCs w:val="false"/>
-          <w:i w:val="false"/>
-          <w:iCs w:val="false"/>
+        <w:t xml:space="preserve"> ‘</w:t>
+      </w:r>
+      <w:r>
+        <w:rPr>
+          <w:rFonts w:ascii="Andale Mono MT Std" w:hAnsi="Andale Mono MT Std"/>
+          <w:b w:val="false"/>
+          <w:bCs w:val="false"/>
+          <w:i/>
+          <w:iCs/>
           <w:caps w:val="false"/>
           <w:smallCaps w:val="false"/>
           <w:color w:val="24292E"/>
@@ -13267,43 +13238,11 @@
           <w:sz w:val="16"/>
           <w:szCs w:val="16"/>
         </w:rPr>
-        <w:t>block comment</w:t>
-      </w:r>
-    </w:p>
-    <w:p>
-      <w:pPr>
-        <w:pStyle w:val="Normal"/>
-        <w:ind w:hanging="0" w:start="0"/>
-        <w:rPr>
-          <w:rFonts w:ascii="Georgia" w:hAnsi="Georgia"/>
-          <w:b w:val="false"/>
-          <w:bCs w:val="false"/>
-          <w:sz w:val="16"/>
-          <w:szCs w:val="16"/>
-        </w:rPr>
-      </w:pPr>
-      <w:r>
-        <w:rPr>
-          <w:rFonts w:ascii="Georgia" w:hAnsi="Georgia"/>
-          <w:b w:val="false"/>
-          <w:bCs w:val="false"/>
-          <w:sz w:val="16"/>
-          <w:szCs w:val="16"/>
-        </w:rPr>
-      </w:r>
-    </w:p>
-    <w:p>
-      <w:pPr>
-        <w:pStyle w:val="Normal"/>
-        <w:ind w:hanging="0" w:start="0"/>
-        <w:rPr>
-          <w:b w:val="false"/>
-          <w:bCs w:val="false"/>
-        </w:rPr>
-      </w:pPr>
-      <w:r>
-        <w:rPr>
-          <w:rFonts w:ascii="Andale Mono" w:hAnsi="Andale Mono"/>
+        <w:t>form</w:t>
+      </w:r>
+      <w:r>
+        <w:rPr>
+          <w:rFonts w:ascii="Andale Mono MT Std" w:hAnsi="Andale Mono MT Std"/>
           <w:b w:val="false"/>
           <w:bCs w:val="false"/>
           <w:i w:val="false"/>
@@ -13315,15 +13254,26 @@
           <w:sz w:val="16"/>
           <w:szCs w:val="16"/>
         </w:rPr>
-        <w:t xml:space="preserve"> ‘</w:t>
-      </w:r>
-      <w:r>
-        <w:rPr>
-          <w:rFonts w:ascii="Georgia" w:hAnsi="Georgia"/>
-          <w:b w:val="false"/>
-          <w:bCs w:val="false"/>
-          <w:i/>
-          <w:iCs/>
+        <w:tab/>
+        <w:tab/>
+        <w:t>quoted form</w:t>
+      </w:r>
+    </w:p>
+    <w:p>
+      <w:pPr>
+        <w:pStyle w:val="Normal"/>
+        <w:ind w:hanging="0" w:left="0"/>
+        <w:rPr>
+          <w:rFonts w:ascii="Andale Mono MT Std" w:hAnsi="Andale Mono MT Std"/>
+        </w:rPr>
+      </w:pPr>
+      <w:r>
+        <w:rPr>
+          <w:rFonts w:ascii="Andale Mono MT Std" w:hAnsi="Andale Mono MT Std"/>
+          <w:b w:val="false"/>
+          <w:bCs w:val="false"/>
+          <w:i w:val="false"/>
+          <w:iCs w:val="false"/>
           <w:caps w:val="false"/>
           <w:smallCaps w:val="false"/>
           <w:color w:val="24292E"/>
@@ -13331,11 +13281,11 @@
           <w:sz w:val="16"/>
           <w:szCs w:val="16"/>
         </w:rPr>
-        <w:t>form</w:t>
-      </w:r>
-      <w:r>
-        <w:rPr>
-          <w:rFonts w:ascii="Andale Mono" w:hAnsi="Andale Mono"/>
+        <w:t xml:space="preserve"> </w:t>
+      </w:r>
+      <w:r>
+        <w:rPr>
+          <w:rFonts w:ascii="Andale Mono MT Std" w:hAnsi="Andale Mono MT Std"/>
           <w:b w:val="false"/>
           <w:bCs w:val="false"/>
           <w:i w:val="false"/>
@@ -13347,16 +13297,15 @@
           <w:sz w:val="16"/>
           <w:szCs w:val="16"/>
         </w:rPr>
-        <w:tab/>
-        <w:tab/>
-      </w:r>
-      <w:r>
-        <w:rPr>
-          <w:rFonts w:ascii="Georgia" w:hAnsi="Georgia"/>
-          <w:b w:val="false"/>
-          <w:bCs w:val="false"/>
-          <w:i w:val="false"/>
-          <w:iCs w:val="false"/>
+        <w:t>`</w:t>
+      </w:r>
+      <w:r>
+        <w:rPr>
+          <w:rFonts w:ascii="Andale Mono MT Std" w:hAnsi="Andale Mono MT Std"/>
+          <w:b w:val="false"/>
+          <w:bCs w:val="false"/>
+          <w:i/>
+          <w:iCs/>
           <w:caps w:val="false"/>
           <w:smallCaps w:val="false"/>
           <w:color w:val="24292E"/>
@@ -13364,21 +13313,11 @@
           <w:sz w:val="16"/>
           <w:szCs w:val="16"/>
         </w:rPr>
-        <w:t>quoted form</w:t>
-      </w:r>
-    </w:p>
-    <w:p>
-      <w:pPr>
-        <w:pStyle w:val="Normal"/>
-        <w:ind w:hanging="0" w:start="0"/>
-        <w:rPr>
-          <w:b w:val="false"/>
-          <w:bCs w:val="false"/>
-        </w:rPr>
-      </w:pPr>
-      <w:r>
-        <w:rPr>
-          <w:rFonts w:ascii="Andale Mono" w:hAnsi="Andale Mono"/>
+        <w:t>form</w:t>
+      </w:r>
+      <w:r>
+        <w:rPr>
+          <w:rFonts w:ascii="Andale Mono MT Std" w:hAnsi="Andale Mono MT Std"/>
           <w:b w:val="false"/>
           <w:bCs w:val="false"/>
           <w:i w:val="false"/>
@@ -13390,11 +13329,22 @@
           <w:sz w:val="16"/>
           <w:szCs w:val="16"/>
         </w:rPr>
-        <w:t xml:space="preserve"> </w:t>
-      </w:r>
-      <w:r>
-        <w:rPr>
-          <w:rFonts w:ascii="Andale Mono" w:hAnsi="Andale Mono"/>
+        <w:tab/>
+        <w:tab/>
+        <w:t>backquoted form</w:t>
+      </w:r>
+    </w:p>
+    <w:p>
+      <w:pPr>
+        <w:pStyle w:val="Normal"/>
+        <w:ind w:hanging="0" w:left="0"/>
+        <w:rPr>
+          <w:rFonts w:ascii="Andale Mono MT Std" w:hAnsi="Andale Mono MT Std"/>
+        </w:rPr>
+      </w:pPr>
+      <w:r>
+        <w:rPr>
+          <w:rFonts w:ascii="Andale Mono MT Std" w:hAnsi="Andale Mono MT Std"/>
           <w:b w:val="false"/>
           <w:bCs w:val="false"/>
           <w:i w:val="false"/>
@@ -13406,15 +13356,15 @@
           <w:sz w:val="16"/>
           <w:szCs w:val="16"/>
         </w:rPr>
-        <w:t>`</w:t>
-      </w:r>
-      <w:r>
-        <w:rPr>
-          <w:rFonts w:ascii="Georgia" w:hAnsi="Georgia"/>
-          <w:b w:val="false"/>
-          <w:bCs w:val="false"/>
-          <w:i/>
-          <w:iCs/>
+        <w:t xml:space="preserve"> </w:t>
+      </w:r>
+      <w:r>
+        <w:rPr>
+          <w:rFonts w:ascii="Andale Mono MT Std" w:hAnsi="Andale Mono MT Std"/>
+          <w:b w:val="false"/>
+          <w:bCs w:val="false"/>
+          <w:i w:val="false"/>
+          <w:iCs w:val="false"/>
           <w:caps w:val="false"/>
           <w:smallCaps w:val="false"/>
           <w:color w:val="24292E"/>
@@ -13422,15 +13372,15 @@
           <w:sz w:val="16"/>
           <w:szCs w:val="16"/>
         </w:rPr>
-        <w:t>form</w:t>
-      </w:r>
-      <w:r>
-        <w:rPr>
-          <w:rFonts w:ascii="Andale Mono" w:hAnsi="Andale Mono"/>
-          <w:b w:val="false"/>
-          <w:bCs w:val="false"/>
-          <w:i w:val="false"/>
-          <w:iCs w:val="false"/>
+        <w:t>`(</w:t>
+      </w:r>
+      <w:r>
+        <w:rPr>
+          <w:rFonts w:ascii="Andale Mono MT Std" w:hAnsi="Andale Mono MT Std"/>
+          <w:b w:val="false"/>
+          <w:bCs w:val="false"/>
+          <w:i/>
+          <w:iCs/>
           <w:caps w:val="false"/>
           <w:smallCaps w:val="false"/>
           <w:color w:val="24292E"/>
@@ -13438,12 +13388,11 @@
           <w:sz w:val="16"/>
           <w:szCs w:val="16"/>
         </w:rPr>
-        <w:tab/>
-        <w:tab/>
-      </w:r>
-      <w:r>
-        <w:rPr>
-          <w:rFonts w:ascii="Georgia" w:hAnsi="Georgia"/>
+        <w:t>...)</w:t>
+      </w:r>
+      <w:r>
+        <w:rPr>
+          <w:rFonts w:ascii="Andale Mono MT Std" w:hAnsi="Andale Mono MT Std"/>
           <w:b w:val="false"/>
           <w:bCs w:val="false"/>
           <w:i w:val="false"/>
@@ -13455,21 +13404,22 @@
           <w:sz w:val="16"/>
           <w:szCs w:val="16"/>
         </w:rPr>
-        <w:t>backquoted form</w:t>
-      </w:r>
-    </w:p>
-    <w:p>
-      <w:pPr>
-        <w:pStyle w:val="Normal"/>
-        <w:ind w:hanging="0" w:start="0"/>
-        <w:rPr>
-          <w:b w:val="false"/>
-          <w:bCs w:val="false"/>
-        </w:rPr>
-      </w:pPr>
-      <w:r>
-        <w:rPr>
-          <w:rFonts w:ascii="Andale Mono" w:hAnsi="Andale Mono"/>
+        <w:tab/>
+        <w:tab/>
+        <w:t>backquoted list (proper lists)</w:t>
+      </w:r>
+    </w:p>
+    <w:p>
+      <w:pPr>
+        <w:pStyle w:val="Normal"/>
+        <w:ind w:hanging="0" w:left="0"/>
+        <w:rPr>
+          <w:rFonts w:ascii="Andale Mono MT Std" w:hAnsi="Andale Mono MT Std"/>
+        </w:rPr>
+      </w:pPr>
+      <w:r>
+        <w:rPr>
+          <w:rFonts w:ascii="Andale Mono MT Std" w:hAnsi="Andale Mono MT Std"/>
           <w:b w:val="false"/>
           <w:bCs w:val="false"/>
           <w:i w:val="false"/>
@@ -13485,7 +13435,7 @@
       </w:r>
       <w:r>
         <w:rPr>
-          <w:rFonts w:ascii="Andale Mono" w:hAnsi="Andale Mono"/>
+          <w:rFonts w:ascii="Andale Mono MT Std" w:hAnsi="Andale Mono MT Std"/>
           <w:b w:val="false"/>
           <w:bCs w:val="false"/>
           <w:i w:val="false"/>
@@ -13497,11 +13447,11 @@
           <w:sz w:val="16"/>
           <w:szCs w:val="16"/>
         </w:rPr>
-        <w:t>`(</w:t>
-      </w:r>
-      <w:r>
-        <w:rPr>
-          <w:rFonts w:ascii="Georgia" w:hAnsi="Georgia"/>
+        <w:t>,</w:t>
+      </w:r>
+      <w:r>
+        <w:rPr>
+          <w:rFonts w:ascii="Andale Mono MT Std" w:hAnsi="Andale Mono MT Std"/>
           <w:b w:val="false"/>
           <w:bCs w:val="false"/>
           <w:i/>
@@ -13513,11 +13463,11 @@
           <w:sz w:val="16"/>
           <w:szCs w:val="16"/>
         </w:rPr>
-        <w:t>...)</w:t>
-      </w:r>
-      <w:r>
-        <w:rPr>
-          <w:rFonts w:ascii="Andale Mono" w:hAnsi="Andale Mono"/>
+        <w:t>form</w:t>
+      </w:r>
+      <w:r>
+        <w:rPr>
+          <w:rFonts w:ascii="Andale Mono MT Std" w:hAnsi="Andale Mono MT Std"/>
           <w:b w:val="false"/>
           <w:bCs w:val="false"/>
           <w:i w:val="false"/>
@@ -13531,10 +13481,20 @@
         </w:rPr>
         <w:tab/>
         <w:tab/>
-      </w:r>
-      <w:r>
-        <w:rPr>
-          <w:rFonts w:ascii="Georgia" w:hAnsi="Georgia"/>
+        <w:t>eval backquoted form</w:t>
+      </w:r>
+    </w:p>
+    <w:p>
+      <w:pPr>
+        <w:pStyle w:val="Normal"/>
+        <w:ind w:hanging="0" w:left="0"/>
+        <w:rPr>
+          <w:rFonts w:ascii="Andale Mono MT Std" w:hAnsi="Andale Mono MT Std"/>
+        </w:rPr>
+      </w:pPr>
+      <w:r>
+        <w:rPr>
+          <w:rFonts w:ascii="Andale Mono MT Std" w:hAnsi="Andale Mono MT Std"/>
           <w:b w:val="false"/>
           <w:bCs w:val="false"/>
           <w:i w:val="false"/>
@@ -13546,21 +13506,11 @@
           <w:sz w:val="16"/>
           <w:szCs w:val="16"/>
         </w:rPr>
-        <w:t>backquoted list (proper lists)</w:t>
-      </w:r>
-    </w:p>
-    <w:p>
-      <w:pPr>
-        <w:pStyle w:val="Normal"/>
-        <w:ind w:hanging="0" w:start="0"/>
-        <w:rPr>
-          <w:b w:val="false"/>
-          <w:bCs w:val="false"/>
-        </w:rPr>
-      </w:pPr>
-      <w:r>
-        <w:rPr>
-          <w:rFonts w:ascii="Andale Mono" w:hAnsi="Andale Mono"/>
+        <w:t xml:space="preserve"> </w:t>
+      </w:r>
+      <w:r>
+        <w:rPr>
+          <w:rFonts w:ascii="Andale Mono MT Std" w:hAnsi="Andale Mono MT Std"/>
           <w:b w:val="false"/>
           <w:bCs w:val="false"/>
           <w:i w:val="false"/>
@@ -13572,15 +13522,15 @@
           <w:sz w:val="16"/>
           <w:szCs w:val="16"/>
         </w:rPr>
-        <w:t xml:space="preserve"> </w:t>
-      </w:r>
-      <w:r>
-        <w:rPr>
-          <w:rFonts w:ascii="Andale Mono" w:hAnsi="Andale Mono"/>
-          <w:b w:val="false"/>
-          <w:bCs w:val="false"/>
-          <w:i w:val="false"/>
-          <w:iCs w:val="false"/>
+        <w:t>,@</w:t>
+      </w:r>
+      <w:r>
+        <w:rPr>
+          <w:rFonts w:ascii="Andale Mono MT Std" w:hAnsi="Andale Mono MT Std"/>
+          <w:b w:val="false"/>
+          <w:bCs w:val="false"/>
+          <w:i/>
+          <w:iCs/>
           <w:caps w:val="false"/>
           <w:smallCaps w:val="false"/>
           <w:color w:val="24292E"/>
@@ -13588,15 +13538,15 @@
           <w:sz w:val="16"/>
           <w:szCs w:val="16"/>
         </w:rPr>
-        <w:t>,</w:t>
-      </w:r>
-      <w:r>
-        <w:rPr>
-          <w:rFonts w:ascii="Georgia" w:hAnsi="Georgia"/>
-          <w:b w:val="false"/>
-          <w:bCs w:val="false"/>
-          <w:i/>
-          <w:iCs/>
+        <w:t>form</w:t>
+      </w:r>
+      <w:r>
+        <w:rPr>
+          <w:rFonts w:ascii="Andale Mono MT Std" w:hAnsi="Andale Mono MT Std"/>
+          <w:b w:val="false"/>
+          <w:bCs w:val="false"/>
+          <w:i w:val="false"/>
+          <w:iCs w:val="false"/>
           <w:caps w:val="false"/>
           <w:smallCaps w:val="false"/>
           <w:color w:val="24292E"/>
@@ -13604,11 +13554,44 @@
           <w:sz w:val="16"/>
           <w:szCs w:val="16"/>
         </w:rPr>
-        <w:t>form</w:t>
-      </w:r>
-      <w:r>
-        <w:rPr>
-          <w:rFonts w:ascii="Andale Mono" w:hAnsi="Andale Mono"/>
+        <w:tab/>
+        <w:tab/>
+        <w:t>eval-splice backquoted form</w:t>
+      </w:r>
+    </w:p>
+    <w:p>
+      <w:pPr>
+        <w:pStyle w:val="Normal"/>
+        <w:ind w:hanging="0" w:left="0"/>
+        <w:rPr>
+          <w:rFonts w:ascii="Andale Mono MT Std" w:hAnsi="Andale Mono MT Std"/>
+          <w:b w:val="false"/>
+          <w:bCs w:val="false"/>
+          <w:sz w:val="16"/>
+          <w:szCs w:val="16"/>
+        </w:rPr>
+      </w:pPr>
+      <w:r>
+        <w:rPr>
+          <w:rFonts w:ascii="Andale Mono MT Std" w:hAnsi="Andale Mono MT Std"/>
+          <w:b w:val="false"/>
+          <w:bCs w:val="false"/>
+          <w:sz w:val="16"/>
+          <w:szCs w:val="16"/>
+        </w:rPr>
+      </w:r>
+    </w:p>
+    <w:p>
+      <w:pPr>
+        <w:pStyle w:val="Normal"/>
+        <w:ind w:hanging="0" w:left="0"/>
+        <w:rPr>
+          <w:rFonts w:ascii="Andale Mono MT Std" w:hAnsi="Andale Mono MT Std"/>
+        </w:rPr>
+      </w:pPr>
+      <w:r>
+        <w:rPr>
+          <w:rFonts w:ascii="Andale Mono MT Std" w:hAnsi="Andale Mono MT Std"/>
           <w:b w:val="false"/>
           <w:bCs w:val="false"/>
           <w:i w:val="false"/>
@@ -13620,12 +13603,11 @@
           <w:sz w:val="16"/>
           <w:szCs w:val="16"/>
         </w:rPr>
-        <w:tab/>
-        <w:tab/>
-      </w:r>
-      <w:r>
-        <w:rPr>
-          <w:rFonts w:ascii="Georgia" w:hAnsi="Georgia"/>
+        <w:t xml:space="preserve"> </w:t>
+      </w:r>
+      <w:r>
+        <w:rPr>
+          <w:rFonts w:ascii="Andale Mono MT Std" w:hAnsi="Andale Mono MT Std"/>
           <w:b w:val="false"/>
           <w:bCs w:val="false"/>
           <w:i w:val="false"/>
@@ -13637,25 +13619,18 @@
           <w:sz w:val="16"/>
           <w:szCs w:val="16"/>
         </w:rPr>
-        <w:t>eval backquoted form</w:t>
-      </w:r>
-    </w:p>
-    <w:p>
-      <w:pPr>
-        <w:pStyle w:val="Normal"/>
-        <w:ind w:hanging="0" w:start="0"/>
-        <w:rPr>
-          <w:b w:val="false"/>
-          <w:bCs w:val="false"/>
-        </w:rPr>
-      </w:pPr>
-      <w:r>
-        <w:rPr>
-          <w:rFonts w:ascii="Andale Mono" w:hAnsi="Andale Mono"/>
-          <w:b w:val="false"/>
-          <w:bCs w:val="false"/>
-          <w:i w:val="false"/>
-          <w:iCs w:val="false"/>
+        <w:t>(…)</w:t>
+        <w:tab/>
+        <w:tab/>
+        <w:t xml:space="preserve">constant </w:t>
+      </w:r>
+      <w:r>
+        <w:rPr>
+          <w:rFonts w:ascii="Andale Mono MT Std" w:hAnsi="Andale Mono MT Std"/>
+          <w:b w:val="false"/>
+          <w:bCs w:val="false"/>
+          <w:i/>
+          <w:iCs/>
           <w:caps w:val="false"/>
           <w:smallCaps w:val="false"/>
           <w:color w:val="24292E"/>
@@ -13663,11 +13638,20 @@
           <w:sz w:val="16"/>
           <w:szCs w:val="16"/>
         </w:rPr>
-        <w:t xml:space="preserve"> </w:t>
-      </w:r>
-      <w:r>
-        <w:rPr>
-          <w:rFonts w:ascii="Andale Mono" w:hAnsi="Andale Mono"/>
+        <w:t>list</w:t>
+      </w:r>
+    </w:p>
+    <w:p>
+      <w:pPr>
+        <w:pStyle w:val="Normal"/>
+        <w:ind w:hanging="0" w:left="0"/>
+        <w:rPr>
+          <w:rFonts w:ascii="Andale Mono MT Std" w:hAnsi="Andale Mono MT Std"/>
+        </w:rPr>
+      </w:pPr>
+      <w:r>
+        <w:rPr>
+          <w:rFonts w:ascii="Andale Mono MT Std" w:hAnsi="Andale Mono MT Std"/>
           <w:b w:val="false"/>
           <w:bCs w:val="false"/>
           <w:i w:val="false"/>
@@ -13679,15 +13663,15 @@
           <w:sz w:val="16"/>
           <w:szCs w:val="16"/>
         </w:rPr>
-        <w:t>,@</w:t>
-      </w:r>
-      <w:r>
-        <w:rPr>
-          <w:rFonts w:ascii="Georgia" w:hAnsi="Georgia"/>
-          <w:b w:val="false"/>
-          <w:bCs w:val="false"/>
-          <w:i/>
-          <w:iCs/>
+        <w:t xml:space="preserve"> </w:t>
+      </w:r>
+      <w:r>
+        <w:rPr>
+          <w:rFonts w:ascii="Andale Mono MT Std" w:hAnsi="Andale Mono MT Std"/>
+          <w:b w:val="false"/>
+          <w:bCs w:val="false"/>
+          <w:i w:val="false"/>
+          <w:iCs w:val="false"/>
           <w:caps w:val="false"/>
           <w:smallCaps w:val="false"/>
           <w:color w:val="24292E"/>
@@ -13695,15 +13679,17 @@
           <w:sz w:val="16"/>
           <w:szCs w:val="16"/>
         </w:rPr>
-        <w:t>form</w:t>
-      </w:r>
-      <w:r>
-        <w:rPr>
-          <w:rFonts w:ascii="Andale Mono" w:hAnsi="Andale Mono"/>
-          <w:b w:val="false"/>
-          <w:bCs w:val="false"/>
-          <w:i w:val="false"/>
-          <w:iCs w:val="false"/>
+        <w:t xml:space="preserve">()           </w:t>
+        <w:tab/>
+        <w:t xml:space="preserve">empty </w:t>
+      </w:r>
+      <w:r>
+        <w:rPr>
+          <w:rFonts w:ascii="Andale Mono MT Std" w:hAnsi="Andale Mono MT Std"/>
+          <w:b w:val="false"/>
+          <w:bCs w:val="false"/>
+          <w:i/>
+          <w:iCs/>
           <w:caps w:val="false"/>
           <w:smallCaps w:val="false"/>
           <w:color w:val="24292E"/>
@@ -13711,12 +13697,11 @@
           <w:sz w:val="16"/>
           <w:szCs w:val="16"/>
         </w:rPr>
-        <w:tab/>
-        <w:tab/>
-      </w:r>
-      <w:r>
-        <w:rPr>
-          <w:rFonts w:ascii="Georgia" w:hAnsi="Georgia"/>
+        <w:t>list</w:t>
+      </w:r>
+      <w:r>
+        <w:rPr>
+          <w:rFonts w:ascii="Andale Mono MT Std" w:hAnsi="Andale Mono MT Std"/>
           <w:b w:val="false"/>
           <w:bCs w:val="false"/>
           <w:i w:val="false"/>
@@ -13728,43 +13713,20 @@
           <w:sz w:val="16"/>
           <w:szCs w:val="16"/>
         </w:rPr>
-        <w:t>eval-splice backquoted form</w:t>
-      </w:r>
-    </w:p>
-    <w:p>
-      <w:pPr>
-        <w:pStyle w:val="Normal"/>
-        <w:ind w:hanging="0" w:start="0"/>
-        <w:rPr>
-          <w:rFonts w:ascii="Andale Mono" w:hAnsi="Andale Mono"/>
-          <w:b w:val="false"/>
-          <w:bCs w:val="false"/>
-          <w:sz w:val="16"/>
-          <w:szCs w:val="16"/>
-        </w:rPr>
-      </w:pPr>
-      <w:r>
-        <w:rPr>
-          <w:rFonts w:ascii="Andale Mono" w:hAnsi="Andale Mono"/>
-          <w:b w:val="false"/>
-          <w:bCs w:val="false"/>
-          <w:sz w:val="16"/>
-          <w:szCs w:val="16"/>
-        </w:rPr>
-      </w:r>
-    </w:p>
-    <w:p>
-      <w:pPr>
-        <w:pStyle w:val="Normal"/>
-        <w:ind w:hanging="0" w:start="0"/>
-        <w:rPr>
-          <w:b w:val="false"/>
-          <w:bCs w:val="false"/>
-        </w:rPr>
-      </w:pPr>
-      <w:r>
-        <w:rPr>
-          <w:rFonts w:ascii="Andale Mono" w:hAnsi="Andale Mono"/>
+        <w:t>, prints as :nil</w:t>
+      </w:r>
+    </w:p>
+    <w:p>
+      <w:pPr>
+        <w:pStyle w:val="Normal"/>
+        <w:ind w:hanging="0" w:left="0"/>
+        <w:rPr>
+          <w:rFonts w:ascii="Andale Mono MT Std" w:hAnsi="Andale Mono MT Std"/>
+        </w:rPr>
+      </w:pPr>
+      <w:r>
+        <w:rPr>
+          <w:rFonts w:ascii="Andale Mono MT Std" w:hAnsi="Andale Mono MT Std"/>
           <w:b w:val="false"/>
           <w:bCs w:val="false"/>
           <w:i w:val="false"/>
@@ -13780,7 +13742,7 @@
       </w:r>
       <w:r>
         <w:rPr>
-          <w:rFonts w:ascii="Andale Mono" w:hAnsi="Andale Mono"/>
+          <w:rFonts w:ascii="Andale Mono MT Std" w:hAnsi="Andale Mono MT Std"/>
           <w:b w:val="false"/>
           <w:bCs w:val="false"/>
           <w:i w:val="false"/>
@@ -13792,13 +13754,27 @@
           <w:sz w:val="16"/>
           <w:szCs w:val="16"/>
         </w:rPr>
-        <w:t>(…)</w:t>
-        <w:tab/>
-        <w:tab/>
-      </w:r>
-      <w:r>
-        <w:rPr>
-          <w:rFonts w:ascii="Georgia" w:hAnsi="Georgia"/>
+        <w:t xml:space="preserve">(… </w:t>
+      </w:r>
+      <w:r>
+        <w:rPr>
+          <w:rFonts w:ascii="Andale Mono MT Std" w:hAnsi="Andale Mono MT Std"/>
+          <w:b w:val="false"/>
+          <w:bCs w:val="false"/>
+          <w:i w:val="false"/>
+          <w:iCs w:val="false"/>
+          <w:caps w:val="false"/>
+          <w:smallCaps w:val="false"/>
+          <w:color w:val="24292E"/>
+          <w:spacing w:val="0"/>
+          <w:sz w:val="18"/>
+          <w:szCs w:val="18"/>
+        </w:rPr>
+        <w:t>.</w:t>
+      </w:r>
+      <w:r>
+        <w:rPr>
+          <w:rFonts w:ascii="Andale Mono MT Std" w:hAnsi="Andale Mono MT Std"/>
           <w:b w:val="false"/>
           <w:bCs w:val="false"/>
           <w:i w:val="false"/>
@@ -13810,11 +13786,13 @@
           <w:sz w:val="16"/>
           <w:szCs w:val="16"/>
         </w:rPr>
-        <w:t xml:space="preserve">constant </w:t>
-      </w:r>
-      <w:r>
-        <w:rPr>
-          <w:rFonts w:ascii="Georgia" w:hAnsi="Georgia"/>
+        <w:t xml:space="preserve"> .)</w:t>
+        <w:tab/>
+        <w:t xml:space="preserve">dotted </w:t>
+      </w:r>
+      <w:r>
+        <w:rPr>
+          <w:rFonts w:ascii="Andale Mono MT Std" w:hAnsi="Andale Mono MT Std"/>
           <w:b w:val="false"/>
           <w:bCs w:val="false"/>
           <w:i/>
@@ -13832,15 +13810,14 @@
     <w:p>
       <w:pPr>
         <w:pStyle w:val="Normal"/>
-        <w:ind w:hanging="0" w:start="0"/>
-        <w:rPr>
-          <w:b w:val="false"/>
-          <w:bCs w:val="false"/>
-        </w:rPr>
-      </w:pPr>
-      <w:r>
-        <w:rPr>
-          <w:rFonts w:ascii="Andale Mono" w:hAnsi="Andale Mono"/>
+        <w:ind w:hanging="0" w:left="0"/>
+        <w:rPr>
+          <w:rFonts w:ascii="Andale Mono MT Std" w:hAnsi="Andale Mono MT Std"/>
+        </w:rPr>
+      </w:pPr>
+      <w:r>
+        <w:rPr>
+          <w:rFonts w:ascii="Andale Mono MT Std" w:hAnsi="Andale Mono MT Std"/>
           <w:b w:val="false"/>
           <w:bCs w:val="false"/>
           <w:i w:val="false"/>
@@ -13852,11 +13829,11 @@
           <w:sz w:val="16"/>
           <w:szCs w:val="16"/>
         </w:rPr>
-        <w:t xml:space="preserve"> </w:t>
-      </w:r>
-      <w:r>
-        <w:rPr>
-          <w:rFonts w:ascii="Andale Mono" w:hAnsi="Andale Mono"/>
+        <w:t xml:space="preserve"> “…”</w:t>
+      </w:r>
+      <w:r>
+        <w:rPr>
+          <w:rFonts w:ascii="Andale Mono MT Std" w:hAnsi="Andale Mono MT Std"/>
           <w:b w:val="false"/>
           <w:bCs w:val="false"/>
           <w:i w:val="false"/>
@@ -13868,16 +13845,16 @@
           <w:sz w:val="16"/>
           <w:szCs w:val="16"/>
         </w:rPr>
-        <w:t xml:space="preserve">()           </w:t>
-        <w:tab/>
-      </w:r>
-      <w:r>
-        <w:rPr>
-          <w:rFonts w:ascii="Georgia" w:hAnsi="Georgia"/>
-          <w:b w:val="false"/>
-          <w:bCs w:val="false"/>
-          <w:i w:val="false"/>
-          <w:iCs w:val="false"/>
+        <w:tab/>
+        <w:tab/>
+      </w:r>
+      <w:r>
+        <w:rPr>
+          <w:rFonts w:ascii="Andale Mono MT Std" w:hAnsi="Andale Mono MT Std"/>
+          <w:b w:val="false"/>
+          <w:bCs w:val="false"/>
+          <w:i/>
+          <w:iCs/>
           <w:caps w:val="false"/>
           <w:smallCaps w:val="false"/>
           <w:color w:val="24292E"/>
@@ -13885,11 +13862,20 @@
           <w:sz w:val="16"/>
           <w:szCs w:val="16"/>
         </w:rPr>
-        <w:t xml:space="preserve">empty </w:t>
-      </w:r>
-      <w:r>
-        <w:rPr>
-          <w:rFonts w:ascii="Georgia" w:hAnsi="Georgia"/>
+        <w:t>string, char vector</w:t>
+      </w:r>
+    </w:p>
+    <w:p>
+      <w:pPr>
+        <w:pStyle w:val="Normal"/>
+        <w:ind w:hanging="0" w:left="0"/>
+        <w:rPr>
+          <w:rFonts w:ascii="Andale Mono MT Std" w:hAnsi="Andale Mono MT Std"/>
+        </w:rPr>
+      </w:pPr>
+      <w:r>
+        <w:rPr>
+          <w:rFonts w:ascii="Andale Mono MT Std" w:hAnsi="Andale Mono MT Std"/>
           <w:b w:val="false"/>
           <w:bCs w:val="false"/>
           <w:i/>
@@ -13901,15 +13887,15 @@
           <w:sz w:val="16"/>
           <w:szCs w:val="16"/>
         </w:rPr>
-        <w:t>list</w:t>
-      </w:r>
-      <w:r>
-        <w:rPr>
-          <w:rFonts w:ascii="Georgia" w:hAnsi="Georgia"/>
-          <w:b w:val="false"/>
-          <w:bCs w:val="false"/>
-          <w:i w:val="false"/>
-          <w:iCs w:val="false"/>
+        <w:t xml:space="preserve"> </w:t>
+      </w:r>
+      <w:r>
+        <w:rPr>
+          <w:rFonts w:ascii="Andale Mono MT Std" w:hAnsi="Andale Mono MT Std"/>
+          <w:b w:val="false"/>
+          <w:bCs w:val="false"/>
+          <w:i/>
+          <w:iCs/>
           <w:caps w:val="false"/>
           <w:smallCaps w:val="false"/>
           <w:color w:val="24292E"/>
@@ -13917,11 +13903,13 @@
           <w:sz w:val="16"/>
           <w:szCs w:val="16"/>
         </w:rPr>
-        <w:t xml:space="preserve">, prints as </w:t>
-      </w:r>
-      <w:r>
-        <w:rPr>
-          <w:rFonts w:ascii="Andale Mono" w:hAnsi="Andale Mono"/>
+        <w:t>\</w:t>
+        <w:tab/>
+        <w:tab/>
+      </w:r>
+      <w:r>
+        <w:rPr>
+          <w:rFonts w:ascii="Andale Mono MT Std" w:hAnsi="Andale Mono MT Std"/>
           <w:b w:val="false"/>
           <w:bCs w:val="false"/>
           <w:i w:val="false"/>
@@ -13933,23 +13921,56 @@
           <w:sz w:val="16"/>
           <w:szCs w:val="16"/>
         </w:rPr>
-        <w:t>:nil</w:t>
-      </w:r>
-    </w:p>
-    <w:p>
-      <w:pPr>
-        <w:pStyle w:val="Normal"/>
-        <w:ind w:hanging="0" w:start="0"/>
-        <w:rPr>
-          <w:b w:val="false"/>
-          <w:bCs w:val="false"/>
-        </w:rPr>
-      </w:pPr>
-      <w:r>
-        <w:rPr>
-          <w:rFonts w:ascii="Andale Mono" w:hAnsi="Andale Mono"/>
-          <w:b w:val="false"/>
-          <w:bCs w:val="false"/>
+        <w:t>single escape in strings</w:t>
+      </w:r>
+    </w:p>
+    <w:p>
+      <w:pPr>
+        <w:pStyle w:val="Normal"/>
+        <w:ind w:hanging="0" w:left="0"/>
+        <w:rPr>
+          <w:rFonts w:ascii="Andale Mono MT Std" w:hAnsi="Andale Mono MT Std"/>
+          <w:b w:val="false"/>
+          <w:bCs w:val="false"/>
+          <w:sz w:val="16"/>
+          <w:szCs w:val="16"/>
+        </w:rPr>
+      </w:pPr>
+      <w:r>
+        <w:rPr>
+          <w:rFonts w:ascii="Andale Mono MT Std" w:hAnsi="Andale Mono MT Std"/>
+          <w:b w:val="false"/>
+          <w:bCs w:val="false"/>
+          <w:sz w:val="16"/>
+          <w:szCs w:val="16"/>
+        </w:rPr>
+      </w:r>
+    </w:p>
+    <w:p>
+      <w:pPr>
+        <w:pStyle w:val="Normal"/>
+        <w:ind w:hanging="0" w:left="0"/>
+        <w:rPr>
+          <w:rFonts w:ascii="Andale Mono MT Std" w:hAnsi="Andale Mono MT Std"/>
+        </w:rPr>
+      </w:pPr>
+      <w:r>
+        <w:rPr>
+          <w:rFonts w:ascii="Andale Mono MT Std" w:hAnsi="Andale Mono MT Std"/>
+          <w:i w:val="false"/>
+          <w:iCs w:val="false"/>
+          <w:caps w:val="false"/>
+          <w:smallCaps w:val="false"/>
+          <w:color w:val="24292E"/>
+          <w:spacing w:val="0"/>
+          <w:sz w:val="20"/>
+          <w:szCs w:val="20"/>
+        </w:rPr>
+        <w:t xml:space="preserve"> </w:t>
+      </w:r>
+      <w:r>
+        <w:rPr>
+          <w:rFonts w:ascii="Andale Mono MT Std" w:hAnsi="Andale Mono MT Std"/>
           <w:i w:val="false"/>
           <w:iCs w:val="false"/>
           <w:caps w:val="false"/>
@@ -13959,13 +13980,26 @@
           <w:sz w:val="16"/>
           <w:szCs w:val="16"/>
         </w:rPr>
-        <w:t xml:space="preserve"> </w:t>
-      </w:r>
-      <w:r>
-        <w:rPr>
-          <w:rFonts w:ascii="Andale Mono" w:hAnsi="Andale Mono"/>
-          <w:b w:val="false"/>
-          <w:bCs w:val="false"/>
+        <w:t>#*...</w:t>
+      </w:r>
+      <w:r>
+        <w:rPr>
+          <w:rFonts w:ascii="Andale Mono MT Std" w:hAnsi="Andale Mono MT Std"/>
+          <w:i w:val="false"/>
+          <w:iCs w:val="false"/>
+          <w:caps w:val="false"/>
+          <w:smallCaps w:val="false"/>
+          <w:color w:val="24292E"/>
+          <w:spacing w:val="0"/>
+          <w:sz w:val="20"/>
+          <w:szCs w:val="20"/>
+        </w:rPr>
+        <w:tab/>
+        <w:tab/>
+      </w:r>
+      <w:r>
+        <w:rPr>
+          <w:rFonts w:ascii="Andale Mono MT Std" w:hAnsi="Andale Mono MT Std"/>
           <w:i w:val="false"/>
           <w:iCs w:val="false"/>
           <w:caps w:val="false"/>
@@ -13975,27 +14009,20 @@
           <w:sz w:val="16"/>
           <w:szCs w:val="16"/>
         </w:rPr>
-        <w:t xml:space="preserve">(… </w:t>
-      </w:r>
-      <w:r>
-        <w:rPr>
-          <w:rFonts w:ascii="Andale Mono" w:hAnsi="Andale Mono"/>
-          <w:b w:val="false"/>
-          <w:bCs w:val="false"/>
-          <w:i w:val="false"/>
-          <w:iCs w:val="false"/>
-          <w:caps w:val="false"/>
-          <w:smallCaps w:val="false"/>
-          <w:color w:val="24292E"/>
-          <w:spacing w:val="0"/>
-          <w:sz w:val="18"/>
-          <w:szCs w:val="18"/>
-        </w:rPr>
-        <w:t>.</w:t>
-      </w:r>
-      <w:r>
-        <w:rPr>
-          <w:rFonts w:ascii="Andale Mono" w:hAnsi="Andale Mono"/>
+        <w:t>bit vector</w:t>
+      </w:r>
+    </w:p>
+    <w:p>
+      <w:pPr>
+        <w:pStyle w:val="Normal"/>
+        <w:ind w:hanging="0" w:left="0"/>
+        <w:rPr>
+          <w:rFonts w:ascii="Andale Mono MT Std" w:hAnsi="Andale Mono MT Std"/>
+        </w:rPr>
+      </w:pPr>
+      <w:r>
+        <w:rPr>
+          <w:rFonts w:ascii="Andale Mono MT Std" w:hAnsi="Andale Mono MT Std"/>
           <w:b w:val="false"/>
           <w:bCs w:val="false"/>
           <w:i w:val="false"/>
@@ -14007,12 +14034,11 @@
           <w:sz w:val="16"/>
           <w:szCs w:val="16"/>
         </w:rPr>
-        <w:t xml:space="preserve"> .)</w:t>
-        <w:tab/>
-      </w:r>
-      <w:r>
-        <w:rPr>
-          <w:rFonts w:ascii="Georgia" w:hAnsi="Georgia"/>
+        <w:t xml:space="preserve"> </w:t>
+      </w:r>
+      <w:r>
+        <w:rPr>
+          <w:rFonts w:ascii="Andale Mono MT Std" w:hAnsi="Andale Mono MT Std"/>
           <w:b w:val="false"/>
           <w:bCs w:val="false"/>
           <w:i w:val="false"/>
@@ -14024,11 +14050,14 @@
           <w:sz w:val="16"/>
           <w:szCs w:val="16"/>
         </w:rPr>
-        <w:t xml:space="preserve">dotted </w:t>
-      </w:r>
-      <w:r>
-        <w:rPr>
-          <w:rFonts w:ascii="Georgia" w:hAnsi="Georgia"/>
+        <w:t>#x...</w:t>
+        <w:tab/>
+        <w:tab/>
+        <w:t xml:space="preserve">hexadecimal </w:t>
+      </w:r>
+      <w:r>
+        <w:rPr>
+          <w:rFonts w:ascii="Andale Mono MT Std" w:hAnsi="Andale Mono MT Std"/>
           <w:b w:val="false"/>
           <w:bCs w:val="false"/>
           <w:i/>
@@ -14040,21 +14069,20 @@
           <w:sz w:val="16"/>
           <w:szCs w:val="16"/>
         </w:rPr>
-        <w:t>list</w:t>
-      </w:r>
-    </w:p>
-    <w:p>
-      <w:pPr>
-        <w:pStyle w:val="Normal"/>
-        <w:ind w:hanging="0" w:start="0"/>
-        <w:rPr>
-          <w:b w:val="false"/>
-          <w:bCs w:val="false"/>
-        </w:rPr>
-      </w:pPr>
-      <w:r>
-        <w:rPr>
-          <w:rFonts w:ascii="Andale Mono" w:hAnsi="Andale Mono"/>
+        <w:t>fixnum</w:t>
+      </w:r>
+    </w:p>
+    <w:p>
+      <w:pPr>
+        <w:pStyle w:val="Normal"/>
+        <w:ind w:hanging="0" w:left="0"/>
+        <w:rPr>
+          <w:rFonts w:ascii="Andale Mono MT Std" w:hAnsi="Andale Mono MT Std"/>
+        </w:rPr>
+      </w:pPr>
+      <w:r>
+        <w:rPr>
+          <w:rFonts w:ascii="Andale Mono MT Std" w:hAnsi="Andale Mono MT Std"/>
           <w:b w:val="false"/>
           <w:bCs w:val="false"/>
           <w:i w:val="false"/>
@@ -14066,11 +14094,11 @@
           <w:sz w:val="16"/>
           <w:szCs w:val="16"/>
         </w:rPr>
-        <w:t xml:space="preserve"> “…”</w:t>
-      </w:r>
-      <w:r>
-        <w:rPr>
-          <w:rFonts w:ascii="Andale Mono" w:hAnsi="Andale Mono"/>
+        <w:t xml:space="preserve"> </w:t>
+      </w:r>
+      <w:r>
+        <w:rPr>
+          <w:rFonts w:ascii="Andale Mono MT Std" w:hAnsi="Andale Mono MT Std"/>
           <w:b w:val="false"/>
           <w:bCs w:val="false"/>
           <w:i w:val="false"/>
@@ -14082,16 +14110,27 @@
           <w:sz w:val="16"/>
           <w:szCs w:val="16"/>
         </w:rPr>
-        <w:tab/>
-        <w:tab/>
-      </w:r>
-      <w:r>
-        <w:rPr>
-          <w:rFonts w:ascii="Georgia" w:hAnsi="Georgia"/>
-          <w:b w:val="false"/>
-          <w:bCs w:val="false"/>
-          <w:i/>
-          <w:iCs/>
+        <w:t>#.</w:t>
+        <w:tab/>
+        <w:tab/>
+        <w:t>read-time eval</w:t>
+      </w:r>
+    </w:p>
+    <w:p>
+      <w:pPr>
+        <w:pStyle w:val="Normal"/>
+        <w:ind w:hanging="0" w:left="0"/>
+        <w:rPr>
+          <w:rFonts w:ascii="Andale Mono MT Std" w:hAnsi="Andale Mono MT Std"/>
+        </w:rPr>
+      </w:pPr>
+      <w:r>
+        <w:rPr>
+          <w:rFonts w:ascii="Andale Mono MT Std" w:hAnsi="Andale Mono MT Std"/>
+          <w:b w:val="false"/>
+          <w:bCs w:val="false"/>
+          <w:i w:val="false"/>
+          <w:iCs w:val="false"/>
           <w:caps w:val="false"/>
           <w:smallCaps w:val="false"/>
           <w:color w:val="24292E"/>
@@ -14099,25 +14138,15 @@
           <w:sz w:val="16"/>
           <w:szCs w:val="16"/>
         </w:rPr>
-        <w:t>string, char vector</w:t>
-      </w:r>
-    </w:p>
-    <w:p>
-      <w:pPr>
-        <w:pStyle w:val="Normal"/>
-        <w:ind w:hanging="0" w:start="0"/>
-        <w:rPr>
-          <w:b w:val="false"/>
-          <w:bCs w:val="false"/>
-        </w:rPr>
-      </w:pPr>
-      <w:r>
-        <w:rPr>
-          <w:rFonts w:ascii="Andale Mono" w:hAnsi="Andale Mono"/>
-          <w:b w:val="false"/>
-          <w:bCs w:val="false"/>
-          <w:i/>
-          <w:iCs/>
+        <w:t xml:space="preserve"> </w:t>
+      </w:r>
+      <w:r>
+        <w:rPr>
+          <w:rFonts w:ascii="Andale Mono MT Std" w:hAnsi="Andale Mono MT Std"/>
+          <w:b w:val="false"/>
+          <w:bCs w:val="false"/>
+          <w:i w:val="false"/>
+          <w:iCs w:val="false"/>
           <w:caps w:val="false"/>
           <w:smallCaps w:val="false"/>
           <w:color w:val="24292E"/>
@@ -14125,11 +14154,13 @@
           <w:sz w:val="16"/>
           <w:szCs w:val="16"/>
         </w:rPr>
-        <w:t xml:space="preserve"> </w:t>
-      </w:r>
-      <w:r>
-        <w:rPr>
-          <w:rFonts w:ascii="Andale Mono" w:hAnsi="Andale Mono"/>
+        <w:t>#\.</w:t>
+        <w:tab/>
+        <w:tab/>
+      </w:r>
+      <w:r>
+        <w:rPr>
+          <w:rFonts w:ascii="Andale Mono MT Std" w:hAnsi="Andale Mono MT Std"/>
           <w:b w:val="false"/>
           <w:bCs w:val="false"/>
           <w:i/>
@@ -14141,13 +14172,20 @@
           <w:sz w:val="16"/>
           <w:szCs w:val="16"/>
         </w:rPr>
-        <w:t>\</w:t>
-        <w:tab/>
-        <w:tab/>
-      </w:r>
-      <w:r>
-        <w:rPr>
-          <w:rFonts w:ascii="Georgia" w:hAnsi="Georgia"/>
+        <w:t>char</w:t>
+      </w:r>
+    </w:p>
+    <w:p>
+      <w:pPr>
+        <w:pStyle w:val="Normal"/>
+        <w:ind w:hanging="0" w:left="0"/>
+        <w:rPr>
+          <w:rFonts w:ascii="Andale Mono MT Std" w:hAnsi="Andale Mono MT Std"/>
+        </w:rPr>
+      </w:pPr>
+      <w:r>
+        <w:rPr>
+          <w:rFonts w:ascii="Andale Mono MT Std" w:hAnsi="Andale Mono MT Std"/>
           <w:b w:val="false"/>
           <w:bCs w:val="false"/>
           <w:i w:val="false"/>
@@ -14159,74 +14197,13 @@
           <w:sz w:val="16"/>
           <w:szCs w:val="16"/>
         </w:rPr>
-        <w:t>single escape in strings</w:t>
-      </w:r>
-    </w:p>
-    <w:p>
-      <w:pPr>
-        <w:pStyle w:val="Normal"/>
-        <w:ind w:hanging="0" w:start="0"/>
-        <w:rPr>
-          <w:rFonts w:ascii="Georgia" w:hAnsi="Georgia"/>
-          <w:b w:val="false"/>
-          <w:bCs w:val="false"/>
-          <w:sz w:val="16"/>
-          <w:szCs w:val="16"/>
-        </w:rPr>
-      </w:pPr>
-      <w:r>
-        <w:rPr>
-          <w:rFonts w:ascii="Georgia" w:hAnsi="Georgia"/>
-          <w:b w:val="false"/>
-          <w:bCs w:val="false"/>
-          <w:sz w:val="16"/>
-          <w:szCs w:val="16"/>
-        </w:rPr>
-      </w:r>
-    </w:p>
-    <w:p>
-      <w:pPr>
-        <w:pStyle w:val="Normal"/>
-        <w:ind w:hanging="0" w:start="0"/>
-        <w:rPr>
-          <w:rFonts w:ascii="Georgia" w:hAnsi="Georgia"/>
-          <w:sz w:val="20"/>
-          <w:szCs w:val="20"/>
-        </w:rPr>
-      </w:pPr>
-      <w:r>
-        <w:rPr>
-          <w:rFonts w:ascii="Georgia" w:hAnsi="Georgia"/>
-          <w:i w:val="false"/>
-          <w:iCs w:val="false"/>
-          <w:caps w:val="false"/>
-          <w:smallCaps w:val="false"/>
-          <w:color w:val="24292E"/>
-          <w:spacing w:val="0"/>
-          <w:sz w:val="20"/>
-          <w:szCs w:val="20"/>
-        </w:rPr>
-        <w:t xml:space="preserve">  </w:t>
-      </w:r>
-      <w:r>
-        <w:rPr>
-          <w:rFonts w:ascii="Georgia" w:hAnsi="Georgia"/>
-          <w:i w:val="false"/>
-          <w:iCs w:val="false"/>
-          <w:caps w:val="false"/>
-          <w:smallCaps w:val="false"/>
-          <w:color w:val="24292E"/>
-          <w:spacing w:val="0"/>
-          <w:sz w:val="20"/>
-          <w:szCs w:val="20"/>
-        </w:rPr>
-        <w:t>#*...</w:t>
-        <w:tab/>
-        <w:tab/>
-      </w:r>
-      <w:r>
-        <w:rPr>
-          <w:rFonts w:ascii="Georgia" w:hAnsi="Georgia"/>
+        <w:t xml:space="preserve"> </w:t>
+      </w:r>
+      <w:r>
+        <w:rPr>
+          <w:rFonts w:ascii="Andale Mono MT Std" w:hAnsi="Andale Mono MT Std"/>
+          <w:b w:val="false"/>
+          <w:bCs w:val="false"/>
           <w:i w:val="false"/>
           <w:iCs w:val="false"/>
           <w:caps w:val="false"/>
@@ -14236,25 +14213,16 @@
           <w:sz w:val="16"/>
           <w:szCs w:val="16"/>
         </w:rPr>
-        <w:t>bit vector</w:t>
-      </w:r>
-    </w:p>
-    <w:p>
-      <w:pPr>
-        <w:pStyle w:val="Normal"/>
-        <w:ind w:hanging="0" w:start="0"/>
-        <w:rPr>
-          <w:b w:val="false"/>
-          <w:bCs w:val="false"/>
-        </w:rPr>
-      </w:pPr>
-      <w:r>
-        <w:rPr>
-          <w:rFonts w:ascii="Andale Mono" w:hAnsi="Andale Mono"/>
-          <w:b w:val="false"/>
-          <w:bCs w:val="false"/>
-          <w:i w:val="false"/>
-          <w:iCs w:val="false"/>
+        <w:t>#(:type …)</w:t>
+        <w:tab/>
+      </w:r>
+      <w:r>
+        <w:rPr>
+          <w:rFonts w:ascii="Andale Mono MT Std" w:hAnsi="Andale Mono MT Std"/>
+          <w:b w:val="false"/>
+          <w:bCs w:val="false"/>
+          <w:i/>
+          <w:iCs/>
           <w:caps w:val="false"/>
           <w:smallCaps w:val="false"/>
           <w:color w:val="24292E"/>
@@ -14262,11 +14230,20 @@
           <w:sz w:val="16"/>
           <w:szCs w:val="16"/>
         </w:rPr>
-        <w:t xml:space="preserve"> </w:t>
-      </w:r>
-      <w:r>
-        <w:rPr>
-          <w:rFonts w:ascii="Andale Mono" w:hAnsi="Andale Mono"/>
+        <w:t>vector</w:t>
+      </w:r>
+    </w:p>
+    <w:p>
+      <w:pPr>
+        <w:pStyle w:val="Normal"/>
+        <w:ind w:hanging="0" w:left="0"/>
+        <w:rPr>
+          <w:rFonts w:ascii="Andale Mono MT Std" w:hAnsi="Andale Mono MT Std"/>
+        </w:rPr>
+      </w:pPr>
+      <w:r>
+        <w:rPr>
+          <w:rFonts w:ascii="Andale Mono MT Std" w:hAnsi="Andale Mono MT Std"/>
           <w:b w:val="false"/>
           <w:bCs w:val="false"/>
           <w:i w:val="false"/>
@@ -14278,13 +14255,11 @@
           <w:sz w:val="16"/>
           <w:szCs w:val="16"/>
         </w:rPr>
-        <w:t>#x...</w:t>
-        <w:tab/>
-        <w:tab/>
-      </w:r>
-      <w:r>
-        <w:rPr>
-          <w:rFonts w:ascii="Georgia" w:hAnsi="Georgia"/>
+        <w:t xml:space="preserve"> </w:t>
+      </w:r>
+      <w:r>
+        <w:rPr>
+          <w:rFonts w:ascii="Andale Mono MT Std" w:hAnsi="Andale Mono MT Std"/>
           <w:b w:val="false"/>
           <w:bCs w:val="false"/>
           <w:i w:val="false"/>
@@ -14296,11 +14271,12 @@
           <w:sz w:val="16"/>
           <w:szCs w:val="16"/>
         </w:rPr>
-        <w:t xml:space="preserve">hexadecimal </w:t>
-      </w:r>
-      <w:r>
-        <w:rPr>
-          <w:rFonts w:ascii="Georgia" w:hAnsi="Georgia"/>
+        <w:t>#s(:type …)</w:t>
+        <w:tab/>
+      </w:r>
+      <w:r>
+        <w:rPr>
+          <w:rFonts w:ascii="Andale Mono MT Std" w:hAnsi="Andale Mono MT Std"/>
           <w:b w:val="false"/>
           <w:bCs w:val="false"/>
           <w:i/>
@@ -14312,21 +14288,20 @@
           <w:sz w:val="16"/>
           <w:szCs w:val="16"/>
         </w:rPr>
-        <w:t>fixnum</w:t>
-      </w:r>
-    </w:p>
-    <w:p>
-      <w:pPr>
-        <w:pStyle w:val="Normal"/>
-        <w:ind w:hanging="0" w:start="0"/>
-        <w:rPr>
-          <w:b w:val="false"/>
-          <w:bCs w:val="false"/>
-        </w:rPr>
-      </w:pPr>
-      <w:r>
-        <w:rPr>
-          <w:rFonts w:ascii="Andale Mono" w:hAnsi="Andale Mono"/>
+        <w:t>struct</w:t>
+      </w:r>
+    </w:p>
+    <w:p>
+      <w:pPr>
+        <w:pStyle w:val="Normal"/>
+        <w:ind w:hanging="0" w:left="0"/>
+        <w:rPr>
+          <w:rFonts w:ascii="Andale Mono MT Std" w:hAnsi="Andale Mono MT Std"/>
+        </w:rPr>
+      </w:pPr>
+      <w:r>
+        <w:rPr>
+          <w:rFonts w:ascii="Andale Mono MT Std" w:hAnsi="Andale Mono MT Std"/>
           <w:b w:val="false"/>
           <w:bCs w:val="false"/>
           <w:i w:val="false"/>
@@ -14342,7 +14317,7 @@
       </w:r>
       <w:r>
         <w:rPr>
-          <w:rFonts w:ascii="Andale Mono" w:hAnsi="Andale Mono"/>
+          <w:rFonts w:ascii="Andale Mono MT Std" w:hAnsi="Andale Mono MT Std"/>
           <w:b w:val="false"/>
           <w:bCs w:val="false"/>
           <w:i w:val="false"/>
@@ -14354,17 +14329,15 @@
           <w:sz w:val="16"/>
           <w:szCs w:val="16"/>
         </w:rPr>
-        <w:t>#.</w:t>
-        <w:tab/>
-        <w:tab/>
-      </w:r>
-      <w:r>
-        <w:rPr>
-          <w:rFonts w:ascii="Georgia" w:hAnsi="Georgia"/>
-          <w:b w:val="false"/>
-          <w:bCs w:val="false"/>
-          <w:i w:val="false"/>
-          <w:iCs w:val="false"/>
+        <w:t>#:symbol</w:t>
+      </w:r>
+      <w:r>
+        <w:rPr>
+          <w:rFonts w:ascii="Andale Mono MT Std" w:hAnsi="Andale Mono MT Std"/>
+          <w:b w:val="false"/>
+          <w:bCs w:val="false"/>
+          <w:i w:val="false"/>
+          <w:iCs/>
           <w:caps w:val="false"/>
           <w:smallCaps w:val="false"/>
           <w:color w:val="24292E"/>
@@ -14372,21 +14345,11 @@
           <w:sz w:val="16"/>
           <w:szCs w:val="16"/>
         </w:rPr>
-        <w:t>read-time eval</w:t>
-      </w:r>
-    </w:p>
-    <w:p>
-      <w:pPr>
-        <w:pStyle w:val="Normal"/>
-        <w:ind w:hanging="0" w:start="0"/>
-        <w:rPr>
-          <w:b w:val="false"/>
-          <w:bCs w:val="false"/>
-        </w:rPr>
-      </w:pPr>
-      <w:r>
-        <w:rPr>
-          <w:rFonts w:ascii="Andale Mono" w:hAnsi="Andale Mono"/>
+        <w:tab/>
+      </w:r>
+      <w:r>
+        <w:rPr>
+          <w:rFonts w:ascii="Andale Mono MT Std" w:hAnsi="Andale Mono MT Std"/>
           <w:b w:val="false"/>
           <w:bCs w:val="false"/>
           <w:i w:val="false"/>
@@ -14398,15 +14361,15 @@
           <w:sz w:val="16"/>
           <w:szCs w:val="16"/>
         </w:rPr>
-        <w:t xml:space="preserve"> </w:t>
-      </w:r>
-      <w:r>
-        <w:rPr>
-          <w:rFonts w:ascii="Andale Mono" w:hAnsi="Andale Mono"/>
-          <w:b w:val="false"/>
-          <w:bCs w:val="false"/>
-          <w:i w:val="false"/>
-          <w:iCs w:val="false"/>
+        <w:t>uninterned</w:t>
+      </w:r>
+      <w:r>
+        <w:rPr>
+          <w:rFonts w:ascii="Andale Mono MT Std" w:hAnsi="Andale Mono MT Std"/>
+          <w:b w:val="false"/>
+          <w:bCs w:val="false"/>
+          <w:i w:val="false"/>
+          <w:iCs/>
           <w:caps w:val="false"/>
           <w:smallCaps w:val="false"/>
           <w:color w:val="24292E"/>
@@ -14414,13 +14377,11 @@
           <w:sz w:val="16"/>
           <w:szCs w:val="16"/>
         </w:rPr>
-        <w:t>#\.</w:t>
-        <w:tab/>
-        <w:tab/>
-      </w:r>
-      <w:r>
-        <w:rPr>
-          <w:rFonts w:ascii="Georgia" w:hAnsi="Georgia"/>
+        <w:t xml:space="preserve"> </w:t>
+      </w:r>
+      <w:r>
+        <w:rPr>
+          <w:rFonts w:ascii="Andale Mono MT Std" w:hAnsi="Andale Mono MT Std"/>
           <w:b w:val="false"/>
           <w:bCs w:val="false"/>
           <w:i/>
@@ -14432,21 +14393,42 @@
           <w:sz w:val="16"/>
           <w:szCs w:val="16"/>
         </w:rPr>
-        <w:t>char</w:t>
-      </w:r>
-    </w:p>
-    <w:p>
-      <w:pPr>
-        <w:pStyle w:val="Normal"/>
-        <w:ind w:hanging="0" w:start="0"/>
-        <w:rPr>
-          <w:b w:val="false"/>
-          <w:bCs w:val="false"/>
-        </w:rPr>
-      </w:pPr>
-      <w:r>
-        <w:rPr>
-          <w:rFonts w:ascii="Andale Mono" w:hAnsi="Andale Mono"/>
+        <w:t>symbol</w:t>
+      </w:r>
+    </w:p>
+    <w:p>
+      <w:pPr>
+        <w:pStyle w:val="Normal"/>
+        <w:ind w:hanging="0" w:left="0"/>
+        <w:rPr>
+          <w:rFonts w:ascii="Andale Mono MT Std" w:hAnsi="Andale Mono MT Std"/>
+          <w:b w:val="false"/>
+          <w:bCs w:val="false"/>
+          <w:sz w:val="16"/>
+          <w:szCs w:val="16"/>
+        </w:rPr>
+      </w:pPr>
+      <w:r>
+        <w:rPr>
+          <w:rFonts w:ascii="Andale Mono MT Std" w:hAnsi="Andale Mono MT Std"/>
+          <w:b w:val="false"/>
+          <w:bCs w:val="false"/>
+          <w:sz w:val="16"/>
+          <w:szCs w:val="16"/>
+        </w:rPr>
+      </w:r>
+    </w:p>
+    <w:p>
+      <w:pPr>
+        <w:pStyle w:val="Normal"/>
+        <w:ind w:hanging="0" w:left="0"/>
+        <w:rPr>
+          <w:rFonts w:ascii="Andale Mono MT Std" w:hAnsi="Andale Mono MT Std"/>
+        </w:rPr>
+      </w:pPr>
+      <w:r>
+        <w:rPr>
+          <w:rFonts w:ascii="Andale Mono MT Std" w:hAnsi="Andale Mono MT Std"/>
           <w:b w:val="false"/>
           <w:bCs w:val="false"/>
           <w:i w:val="false"/>
@@ -14458,11 +14440,11 @@
           <w:sz w:val="16"/>
           <w:szCs w:val="16"/>
         </w:rPr>
-        <w:t xml:space="preserve"> </w:t>
-      </w:r>
-      <w:r>
-        <w:rPr>
-          <w:rFonts w:ascii="Andale Mono" w:hAnsi="Andale Mono"/>
+        <w:t xml:space="preserve"> “</w:t>
+      </w:r>
+      <w:r>
+        <w:rPr>
+          <w:rFonts w:ascii="Andale Mono MT Std" w:hAnsi="Andale Mono MT Std"/>
           <w:b w:val="false"/>
           <w:bCs w:val="false"/>
           <w:i w:val="false"/>
@@ -14474,16 +14456,27 @@
           <w:sz w:val="16"/>
           <w:szCs w:val="16"/>
         </w:rPr>
-        <w:t>#(:type …)</w:t>
-        <w:tab/>
-      </w:r>
-      <w:r>
-        <w:rPr>
-          <w:rFonts w:ascii="Georgia" w:hAnsi="Georgia"/>
-          <w:b w:val="false"/>
-          <w:bCs w:val="false"/>
-          <w:i/>
-          <w:iCs/>
+        <w:t>`,;</w:t>
+        <w:tab/>
+        <w:tab/>
+        <w:t>terminating macro char</w:t>
+      </w:r>
+    </w:p>
+    <w:p>
+      <w:pPr>
+        <w:pStyle w:val="Normal"/>
+        <w:ind w:hanging="0" w:left="0"/>
+        <w:rPr>
+          <w:rFonts w:ascii="Andale Mono MT Std" w:hAnsi="Andale Mono MT Std"/>
+        </w:rPr>
+      </w:pPr>
+      <w:r>
+        <w:rPr>
+          <w:rFonts w:ascii="Andale Mono MT Std" w:hAnsi="Andale Mono MT Std"/>
+          <w:b w:val="false"/>
+          <w:bCs w:val="false"/>
+          <w:i w:val="false"/>
+          <w:iCs w:val="false"/>
           <w:caps w:val="false"/>
           <w:smallCaps w:val="false"/>
           <w:color w:val="24292E"/>
@@ -14491,21 +14484,11 @@
           <w:sz w:val="16"/>
           <w:szCs w:val="16"/>
         </w:rPr>
-        <w:t>vector</w:t>
-      </w:r>
-    </w:p>
-    <w:p>
-      <w:pPr>
-        <w:pStyle w:val="Normal"/>
-        <w:ind w:hanging="0" w:start="0"/>
-        <w:rPr>
-          <w:b w:val="false"/>
-          <w:bCs w:val="false"/>
-        </w:rPr>
-      </w:pPr>
-      <w:r>
-        <w:rPr>
-          <w:rFonts w:ascii="Andale Mono" w:hAnsi="Andale Mono"/>
+        <w:t xml:space="preserve"> </w:t>
+      </w:r>
+      <w:r>
+        <w:rPr>
+          <w:rFonts w:ascii="Andale Mono MT Std" w:hAnsi="Andale Mono MT Std"/>
           <w:b w:val="false"/>
           <w:bCs w:val="false"/>
           <w:i w:val="false"/>
@@ -14517,11 +14500,18 @@
           <w:sz w:val="16"/>
           <w:szCs w:val="16"/>
         </w:rPr>
-        <w:t xml:space="preserve"> </w:t>
-      </w:r>
-      <w:r>
-        <w:rPr>
-          <w:rFonts w:ascii="Andale Mono" w:hAnsi="Andale Mono"/>
+        <w:t>#</w:t>
+        <w:tab/>
+        <w:tab/>
+        <w:t>non-terminating macro char</w:t>
+      </w:r>
+    </w:p>
+    <w:p>
+      <w:pPr>
+        <w:pStyle w:val="Normal"/>
+        <w:ind w:hanging="0" w:left="0"/>
+        <w:rPr>
+          <w:rFonts w:ascii="Andale Mono MT Std" w:hAnsi="Andale Mono MT Std"/>
           <w:b w:val="false"/>
           <w:bCs w:val="false"/>
           <w:i w:val="false"/>
@@ -14533,16 +14523,14 @@
           <w:sz w:val="16"/>
           <w:szCs w:val="16"/>
         </w:rPr>
-        <w:t>#s(:type …)</w:t>
-        <w:tab/>
-      </w:r>
-      <w:r>
-        <w:rPr>
-          <w:rFonts w:ascii="Georgia" w:hAnsi="Georgia"/>
-          <w:b w:val="false"/>
-          <w:bCs w:val="false"/>
-          <w:i/>
-          <w:iCs/>
+      </w:pPr>
+      <w:r>
+        <w:rPr>
+          <w:rFonts w:ascii="Andale Mono MT Std" w:hAnsi="Andale Mono MT Std"/>
+          <w:b w:val="false"/>
+          <w:bCs w:val="false"/>
+          <w:i w:val="false"/>
+          <w:iCs w:val="false"/>
           <w:caps w:val="false"/>
           <w:smallCaps w:val="false"/>
           <w:color w:val="24292E"/>
@@ -14550,21 +14538,19 @@
           <w:sz w:val="16"/>
           <w:szCs w:val="16"/>
         </w:rPr>
-        <w:t>struct</w:t>
-      </w:r>
-    </w:p>
-    <w:p>
-      <w:pPr>
-        <w:pStyle w:val="Normal"/>
-        <w:ind w:hanging="0" w:start="0"/>
-        <w:rPr>
-          <w:b w:val="false"/>
-          <w:bCs w:val="false"/>
-        </w:rPr>
-      </w:pPr>
-      <w:r>
-        <w:rPr>
-          <w:rFonts w:ascii="Andale Mono" w:hAnsi="Andale Mono"/>
+      </w:r>
+    </w:p>
+    <w:p>
+      <w:pPr>
+        <w:pStyle w:val="Normal"/>
+        <w:ind w:hanging="0" w:left="0"/>
+        <w:rPr>
+          <w:rFonts w:ascii="Andale Mono MT Std" w:hAnsi="Andale Mono MT Std"/>
+        </w:rPr>
+      </w:pPr>
+      <w:r>
+        <w:rPr>
+          <w:rFonts w:ascii="Andale Mono MT Std" w:hAnsi="Andale Mono MT Std"/>
           <w:b w:val="false"/>
           <w:bCs w:val="false"/>
           <w:i w:val="false"/>
@@ -14580,7 +14566,7 @@
       </w:r>
       <w:r>
         <w:rPr>
-          <w:rFonts w:ascii="Andale Mono" w:hAnsi="Andale Mono"/>
+          <w:rFonts w:ascii="Andale Mono MT Std" w:hAnsi="Andale Mono MT Std"/>
           <w:b w:val="false"/>
           <w:bCs w:val="false"/>
           <w:i w:val="false"/>
@@ -14592,15 +14578,26 @@
           <w:sz w:val="16"/>
           <w:szCs w:val="16"/>
         </w:rPr>
-        <w:t>#:symbol</w:t>
-      </w:r>
-      <w:r>
-        <w:rPr>
-          <w:rFonts w:ascii="Andale Mono" w:hAnsi="Andale Mono"/>
-          <w:b w:val="false"/>
-          <w:bCs w:val="false"/>
-          <w:i w:val="false"/>
-          <w:iCs/>
+        <w:t>!$%&amp;*+-.</w:t>
+        <w:tab/>
+        <w:t>symbol constituents</w:t>
+      </w:r>
+    </w:p>
+    <w:p>
+      <w:pPr>
+        <w:pStyle w:val="Normal"/>
+        <w:ind w:hanging="0" w:left="0"/>
+        <w:rPr>
+          <w:rFonts w:ascii="Andale Mono MT Std" w:hAnsi="Andale Mono MT Std"/>
+        </w:rPr>
+      </w:pPr>
+      <w:r>
+        <w:rPr>
+          <w:rFonts w:ascii="Andale Mono MT Std" w:hAnsi="Andale Mono MT Std"/>
+          <w:b w:val="false"/>
+          <w:bCs w:val="false"/>
+          <w:i w:val="false"/>
+          <w:iCs w:val="false"/>
           <w:caps w:val="false"/>
           <w:smallCaps w:val="false"/>
           <w:color w:val="24292E"/>
@@ -14608,11 +14605,11 @@
           <w:sz w:val="16"/>
           <w:szCs w:val="16"/>
         </w:rPr>
-        <w:tab/>
-      </w:r>
-      <w:r>
-        <w:rPr>
-          <w:rFonts w:ascii="Georgia" w:hAnsi="Georgia"/>
+        <w:t xml:space="preserve"> </w:t>
+      </w:r>
+      <w:r>
+        <w:rPr>
+          <w:rFonts w:ascii="Andale Mono MT Std" w:hAnsi="Andale Mono MT Std"/>
           <w:b w:val="false"/>
           <w:bCs w:val="false"/>
           <w:i w:val="false"/>
@@ -14624,15 +14621,24 @@
           <w:sz w:val="16"/>
           <w:szCs w:val="16"/>
         </w:rPr>
-        <w:t>uninterned</w:t>
-      </w:r>
-      <w:r>
-        <w:rPr>
-          <w:rFonts w:ascii="Georgia" w:hAnsi="Georgia"/>
-          <w:b w:val="false"/>
-          <w:bCs w:val="false"/>
-          <w:i w:val="false"/>
-          <w:iCs/>
+        <w:t>&lt;&gt;=?@[]|</w:t>
+      </w:r>
+    </w:p>
+    <w:p>
+      <w:pPr>
+        <w:pStyle w:val="Normal"/>
+        <w:ind w:hanging="0" w:left="0"/>
+        <w:rPr>
+          <w:rFonts w:ascii="Andale Mono MT Std" w:hAnsi="Andale Mono MT Std"/>
+        </w:rPr>
+      </w:pPr>
+      <w:r>
+        <w:rPr>
+          <w:rFonts w:ascii="Andale Mono MT Std" w:hAnsi="Andale Mono MT Std"/>
+          <w:b w:val="false"/>
+          <w:bCs w:val="false"/>
+          <w:i w:val="false"/>
+          <w:iCs w:val="false"/>
           <w:caps w:val="false"/>
           <w:smallCaps w:val="false"/>
           <w:color w:val="24292E"/>
@@ -14644,11 +14650,11 @@
       </w:r>
       <w:r>
         <w:rPr>
-          <w:rFonts w:ascii="Georgia" w:hAnsi="Georgia"/>
-          <w:b w:val="false"/>
-          <w:bCs w:val="false"/>
-          <w:i/>
-          <w:iCs/>
+          <w:rFonts w:ascii="Andale Mono MT Std" w:hAnsi="Andale Mono MT Std"/>
+          <w:b w:val="false"/>
+          <w:bCs w:val="false"/>
+          <w:i w:val="false"/>
+          <w:iCs w:val="false"/>
           <w:caps w:val="false"/>
           <w:smallCaps w:val="false"/>
           <w:color w:val="24292E"/>
@@ -14656,43 +14662,20 @@
           <w:sz w:val="16"/>
           <w:szCs w:val="16"/>
         </w:rPr>
-        <w:t>symbol</w:t>
-      </w:r>
-    </w:p>
-    <w:p>
-      <w:pPr>
-        <w:pStyle w:val="Normal"/>
-        <w:ind w:hanging="0" w:start="0"/>
-        <w:rPr>
-          <w:rFonts w:ascii="Georgia" w:hAnsi="Georgia"/>
-          <w:b w:val="false"/>
-          <w:bCs w:val="false"/>
-          <w:sz w:val="16"/>
-          <w:szCs w:val="16"/>
-        </w:rPr>
-      </w:pPr>
-      <w:r>
-        <w:rPr>
-          <w:rFonts w:ascii="Georgia" w:hAnsi="Georgia"/>
-          <w:b w:val="false"/>
-          <w:bCs w:val="false"/>
-          <w:sz w:val="16"/>
-          <w:szCs w:val="16"/>
-        </w:rPr>
-      </w:r>
-    </w:p>
-    <w:p>
-      <w:pPr>
-        <w:pStyle w:val="Normal"/>
-        <w:ind w:hanging="0" w:start="0"/>
-        <w:rPr>
-          <w:b w:val="false"/>
-          <w:bCs w:val="false"/>
-        </w:rPr>
-      </w:pPr>
-      <w:r>
-        <w:rPr>
-          <w:rFonts w:ascii="Andale Mono" w:hAnsi="Andale Mono"/>
+        <w:t>:^_{}~/</w:t>
+      </w:r>
+    </w:p>
+    <w:p>
+      <w:pPr>
+        <w:pStyle w:val="Normal"/>
+        <w:ind w:hanging="0" w:left="0"/>
+        <w:rPr>
+          <w:rFonts w:ascii="Andale Mono MT Std" w:hAnsi="Andale Mono MT Std"/>
+        </w:rPr>
+      </w:pPr>
+      <w:r>
+        <w:rPr>
+          <w:rFonts w:ascii="Andale Mono MT Std" w:hAnsi="Andale Mono MT Std"/>
           <w:b w:val="false"/>
           <w:bCs w:val="false"/>
           <w:i w:val="false"/>
@@ -14704,11 +14687,11 @@
           <w:sz w:val="16"/>
           <w:szCs w:val="16"/>
         </w:rPr>
-        <w:t xml:space="preserve"> “</w:t>
-      </w:r>
-      <w:r>
-        <w:rPr>
-          <w:rFonts w:ascii="Andale Mono" w:hAnsi="Andale Mono"/>
+        <w:t xml:space="preserve"> </w:t>
+      </w:r>
+      <w:r>
+        <w:rPr>
+          <w:rFonts w:ascii="Andale Mono MT Std" w:hAnsi="Andale Mono MT Std"/>
           <w:b w:val="false"/>
           <w:bCs w:val="false"/>
           <w:i w:val="false"/>
@@ -14720,13 +14703,20 @@
           <w:sz w:val="16"/>
           <w:szCs w:val="16"/>
         </w:rPr>
-        <w:t>`,;</w:t>
-        <w:tab/>
-        <w:tab/>
-      </w:r>
-      <w:r>
-        <w:rPr>
-          <w:rFonts w:ascii="Georgia" w:hAnsi="Georgia"/>
+        <w:t>A..Za..z</w:t>
+      </w:r>
+    </w:p>
+    <w:p>
+      <w:pPr>
+        <w:pStyle w:val="Normal"/>
+        <w:ind w:hanging="0" w:left="0"/>
+        <w:rPr>
+          <w:rFonts w:ascii="Andale Mono MT Std" w:hAnsi="Andale Mono MT Std"/>
+        </w:rPr>
+      </w:pPr>
+      <w:r>
+        <w:rPr>
+          <w:rFonts w:ascii="Andale Mono MT Std" w:hAnsi="Andale Mono MT Std"/>
           <w:b w:val="false"/>
           <w:bCs w:val="false"/>
           <w:i w:val="false"/>
@@ -14738,21 +14728,11 @@
           <w:sz w:val="16"/>
           <w:szCs w:val="16"/>
         </w:rPr>
-        <w:t>terminating macro char</w:t>
-      </w:r>
-    </w:p>
-    <w:p>
-      <w:pPr>
-        <w:pStyle w:val="Normal"/>
-        <w:ind w:hanging="0" w:start="0"/>
-        <w:rPr>
-          <w:b w:val="false"/>
-          <w:bCs w:val="false"/>
-        </w:rPr>
-      </w:pPr>
-      <w:r>
-        <w:rPr>
-          <w:rFonts w:ascii="Andale Mono" w:hAnsi="Andale Mono"/>
+        <w:t xml:space="preserve"> </w:t>
+      </w:r>
+      <w:r>
+        <w:rPr>
+          <w:rFonts w:ascii="Andale Mono MT Std" w:hAnsi="Andale Mono MT Std"/>
           <w:b w:val="false"/>
           <w:bCs w:val="false"/>
           <w:i w:val="false"/>
@@ -14764,11 +14744,15 @@
           <w:sz w:val="16"/>
           <w:szCs w:val="16"/>
         </w:rPr>
-        <w:t xml:space="preserve"> </w:t>
-      </w:r>
-      <w:r>
-        <w:rPr>
-          <w:rFonts w:ascii="Andale Mono" w:hAnsi="Andale Mono"/>
+        <w:t xml:space="preserve">0..9      </w:t>
+      </w:r>
+    </w:p>
+    <w:p>
+      <w:pPr>
+        <w:pStyle w:val="Normal"/>
+        <w:ind w:hanging="0" w:left="0"/>
+        <w:rPr>
+          <w:rFonts w:ascii="Andale Mono MT Std" w:hAnsi="Andale Mono MT Std"/>
           <w:b w:val="false"/>
           <w:bCs w:val="false"/>
           <w:i w:val="false"/>
@@ -14780,13 +14764,10 @@
           <w:sz w:val="16"/>
           <w:szCs w:val="16"/>
         </w:rPr>
-        <w:t>#</w:t>
-        <w:tab/>
-        <w:tab/>
-      </w:r>
-      <w:r>
-        <w:rPr>
-          <w:rFonts w:ascii="Georgia" w:hAnsi="Georgia"/>
+      </w:pPr>
+      <w:r>
+        <w:rPr>
+          <w:rFonts w:ascii="Andale Mono MT Std" w:hAnsi="Andale Mono MT Std"/>
           <w:b w:val="false"/>
           <w:bCs w:val="false"/>
           <w:i w:val="false"/>
@@ -14798,18 +14779,21 @@
           <w:sz w:val="16"/>
           <w:szCs w:val="16"/>
         </w:rPr>
-        <w:t>non-terminating macro char</w:t>
-      </w:r>
-    </w:p>
-    <w:p>
-      <w:pPr>
-        <w:pStyle w:val="Normal"/>
-        <w:ind w:hanging="0" w:start="0"/>
-        <w:rPr>
-          <w:rFonts w:ascii="Georgia" w:hAnsi="Georgia"/>
-          <w:b w:val="false"/>
-          <w:bCs w:val="false"/>
-          <w:i w:val="false"/>
+      </w:r>
+    </w:p>
+    <w:p>
+      <w:pPr>
+        <w:pStyle w:val="Normal"/>
+        <w:ind w:hanging="0" w:left="0"/>
+        <w:rPr>
+          <w:rFonts w:ascii="Andale Mono MT Std" w:hAnsi="Andale Mono MT Std"/>
+        </w:rPr>
+      </w:pPr>
+      <w:r>
+        <w:rPr>
+          <w:rFonts w:ascii="Andale Mono MT Std" w:hAnsi="Andale Mono MT Std"/>
+          <w:b w:val="false"/>
+          <w:bCs w:val="false"/>
           <w:i w:val="false"/>
           <w:iCs w:val="false"/>
           <w:caps w:val="false"/>
@@ -14819,10 +14803,11 @@
           <w:sz w:val="16"/>
           <w:szCs w:val="16"/>
         </w:rPr>
-      </w:pPr>
-      <w:r>
-        <w:rPr>
-          <w:rFonts w:ascii="Georgia" w:hAnsi="Georgia"/>
+        <w:t xml:space="preserve"> </w:t>
+      </w:r>
+      <w:r>
+        <w:rPr>
+          <w:rFonts w:ascii="Andale Mono MT Std" w:hAnsi="Andale Mono MT Std"/>
           <w:b w:val="false"/>
           <w:bCs w:val="false"/>
           <w:i w:val="false"/>
@@ -14834,20 +14819,22 @@
           <w:sz w:val="16"/>
           <w:szCs w:val="16"/>
         </w:rPr>
-      </w:r>
-    </w:p>
-    <w:p>
-      <w:pPr>
-        <w:pStyle w:val="Normal"/>
-        <w:ind w:hanging="0" w:start="0"/>
-        <w:rPr>
-          <w:b w:val="false"/>
-          <w:bCs w:val="false"/>
-        </w:rPr>
-      </w:pPr>
-      <w:r>
-        <w:rPr>
-          <w:rFonts w:ascii="Andale Mono" w:hAnsi="Andale Mono"/>
+        <w:t>0x09 #\tab</w:t>
+        <w:tab/>
+        <w:t>whitespace</w:t>
+      </w:r>
+    </w:p>
+    <w:p>
+      <w:pPr>
+        <w:pStyle w:val="Normal"/>
+        <w:ind w:hanging="0" w:left="0"/>
+        <w:rPr>
+          <w:rFonts w:ascii="Andale Mono MT Std" w:hAnsi="Andale Mono MT Std"/>
+        </w:rPr>
+      </w:pPr>
+      <w:r>
+        <w:rPr>
+          <w:rFonts w:ascii="Andale Mono MT Std" w:hAnsi="Andale Mono MT Std"/>
           <w:b w:val="false"/>
           <w:bCs w:val="false"/>
           <w:i w:val="false"/>
@@ -14863,7 +14850,7 @@
       </w:r>
       <w:r>
         <w:rPr>
-          <w:rFonts w:ascii="Andale Mono" w:hAnsi="Andale Mono"/>
+          <w:rFonts w:ascii="Andale Mono MT Std" w:hAnsi="Andale Mono MT Std"/>
           <w:b w:val="false"/>
           <w:bCs w:val="false"/>
           <w:i w:val="false"/>
@@ -14875,12 +14862,20 @@
           <w:sz w:val="16"/>
           <w:szCs w:val="16"/>
         </w:rPr>
-        <w:t>!$%&amp;*+-.</w:t>
-        <w:tab/>
-      </w:r>
-      <w:r>
-        <w:rPr>
-          <w:rFonts w:ascii="Georgia" w:hAnsi="Georgia"/>
+        <w:t xml:space="preserve">0x0a #\linefeed </w:t>
+      </w:r>
+    </w:p>
+    <w:p>
+      <w:pPr>
+        <w:pStyle w:val="Normal"/>
+        <w:ind w:hanging="0" w:left="0"/>
+        <w:rPr>
+          <w:rFonts w:ascii="Andale Mono MT Std" w:hAnsi="Andale Mono MT Std"/>
+        </w:rPr>
+      </w:pPr>
+      <w:r>
+        <w:rPr>
+          <w:rFonts w:ascii="Andale Mono MT Std" w:hAnsi="Andale Mono MT Std"/>
           <w:b w:val="false"/>
           <w:bCs w:val="false"/>
           <w:i w:val="false"/>
@@ -14892,21 +14887,11 @@
           <w:sz w:val="16"/>
           <w:szCs w:val="16"/>
         </w:rPr>
-        <w:t>symbol constituents</w:t>
-      </w:r>
-    </w:p>
-    <w:p>
-      <w:pPr>
-        <w:pStyle w:val="Normal"/>
-        <w:ind w:hanging="0" w:start="0"/>
-        <w:rPr>
-          <w:b w:val="false"/>
-          <w:bCs w:val="false"/>
-        </w:rPr>
-      </w:pPr>
-      <w:r>
-        <w:rPr>
-          <w:rFonts w:ascii="Andale Mono" w:hAnsi="Andale Mono"/>
+        <w:t xml:space="preserve"> </w:t>
+      </w:r>
+      <w:r>
+        <w:rPr>
+          <w:rFonts w:ascii="Andale Mono MT Std" w:hAnsi="Andale Mono MT Std"/>
           <w:b w:val="false"/>
           <w:bCs w:val="false"/>
           <w:i w:val="false"/>
@@ -14918,11 +14903,20 @@
           <w:sz w:val="16"/>
           <w:szCs w:val="16"/>
         </w:rPr>
-        <w:t xml:space="preserve"> </w:t>
-      </w:r>
-      <w:r>
-        <w:rPr>
-          <w:rFonts w:ascii="Andale Mono" w:hAnsi="Andale Mono"/>
+        <w:t xml:space="preserve">0x0c #\page                </w:t>
+      </w:r>
+    </w:p>
+    <w:p>
+      <w:pPr>
+        <w:pStyle w:val="Normal"/>
+        <w:ind w:hanging="0" w:left="0"/>
+        <w:rPr>
+          <w:rFonts w:ascii="Andale Mono MT Std" w:hAnsi="Andale Mono MT Std"/>
+        </w:rPr>
+      </w:pPr>
+      <w:r>
+        <w:rPr>
+          <w:rFonts w:ascii="Andale Mono MT Std" w:hAnsi="Andale Mono MT Std"/>
           <w:b w:val="false"/>
           <w:bCs w:val="false"/>
           <w:i w:val="false"/>
@@ -14934,21 +14928,11 @@
           <w:sz w:val="16"/>
           <w:szCs w:val="16"/>
         </w:rPr>
-        <w:t>&lt;&gt;=?@[]|</w:t>
-      </w:r>
-    </w:p>
-    <w:p>
-      <w:pPr>
-        <w:pStyle w:val="Normal"/>
-        <w:ind w:hanging="0" w:start="0"/>
-        <w:rPr>
-          <w:b w:val="false"/>
-          <w:bCs w:val="false"/>
-        </w:rPr>
-      </w:pPr>
-      <w:r>
-        <w:rPr>
-          <w:rFonts w:ascii="Andale Mono" w:hAnsi="Andale Mono"/>
+        <w:t xml:space="preserve"> </w:t>
+      </w:r>
+      <w:r>
+        <w:rPr>
+          <w:rFonts w:ascii="Andale Mono MT Std" w:hAnsi="Andale Mono MT Std"/>
           <w:b w:val="false"/>
           <w:bCs w:val="false"/>
           <w:i w:val="false"/>
@@ -14960,11 +14944,20 @@
           <w:sz w:val="16"/>
           <w:szCs w:val="16"/>
         </w:rPr>
-        <w:t xml:space="preserve"> </w:t>
-      </w:r>
-      <w:r>
-        <w:rPr>
-          <w:rFonts w:ascii="Andale Mono" w:hAnsi="Andale Mono"/>
+        <w:t xml:space="preserve">0x0d #\return            </w:t>
+      </w:r>
+    </w:p>
+    <w:p>
+      <w:pPr>
+        <w:pStyle w:val="Normal"/>
+        <w:ind w:hanging="0" w:left="0"/>
+        <w:rPr>
+          <w:rFonts w:ascii="Andale Mono MT Std" w:hAnsi="Andale Mono MT Std"/>
+        </w:rPr>
+      </w:pPr>
+      <w:r>
+        <w:rPr>
+          <w:rFonts w:ascii="Andale Mono MT Std" w:hAnsi="Andale Mono MT Std"/>
           <w:b w:val="false"/>
           <w:bCs w:val="false"/>
           <w:i w:val="false"/>
@@ -14976,341 +14969,11 @@
           <w:sz w:val="16"/>
           <w:szCs w:val="16"/>
         </w:rPr>
-        <w:t>:^_{}~/</w:t>
-      </w:r>
-    </w:p>
-    <w:p>
-      <w:pPr>
-        <w:pStyle w:val="Normal"/>
-        <w:ind w:hanging="0" w:start="0"/>
-        <w:rPr>
-          <w:b w:val="false"/>
-          <w:bCs w:val="false"/>
-        </w:rPr>
-      </w:pPr>
-      <w:r>
-        <w:rPr>
-          <w:rFonts w:ascii="Andale Mono" w:hAnsi="Andale Mono"/>
-          <w:b w:val="false"/>
-          <w:bCs w:val="false"/>
-          <w:i w:val="false"/>
-          <w:iCs w:val="false"/>
-          <w:caps w:val="false"/>
-          <w:smallCaps w:val="false"/>
-          <w:color w:val="24292E"/>
-          <w:spacing w:val="0"/>
-          <w:sz w:val="16"/>
-          <w:szCs w:val="16"/>
-        </w:rPr>
-        <w:t xml:space="preserve"> </w:t>
-      </w:r>
-      <w:r>
-        <w:rPr>
-          <w:rFonts w:ascii="Andale Mono" w:hAnsi="Andale Mono"/>
-          <w:b w:val="false"/>
-          <w:bCs w:val="false"/>
-          <w:i w:val="false"/>
-          <w:iCs w:val="false"/>
-          <w:caps w:val="false"/>
-          <w:smallCaps w:val="false"/>
-          <w:color w:val="24292E"/>
-          <w:spacing w:val="0"/>
-          <w:sz w:val="16"/>
-          <w:szCs w:val="16"/>
-        </w:rPr>
-        <w:t>A..Za..z</w:t>
-      </w:r>
-    </w:p>
-    <w:p>
-      <w:pPr>
-        <w:pStyle w:val="Normal"/>
-        <w:ind w:hanging="0" w:start="0"/>
-        <w:rPr>
-          <w:b w:val="false"/>
-          <w:bCs w:val="false"/>
-        </w:rPr>
-      </w:pPr>
-      <w:r>
-        <w:rPr>
-          <w:rFonts w:ascii="Andale Mono" w:hAnsi="Andale Mono"/>
-          <w:b w:val="false"/>
-          <w:bCs w:val="false"/>
-          <w:i w:val="false"/>
-          <w:iCs w:val="false"/>
-          <w:caps w:val="false"/>
-          <w:smallCaps w:val="false"/>
-          <w:color w:val="24292E"/>
-          <w:spacing w:val="0"/>
-          <w:sz w:val="16"/>
-          <w:szCs w:val="16"/>
-        </w:rPr>
-        <w:t xml:space="preserve"> </w:t>
-      </w:r>
-      <w:r>
-        <w:rPr>
-          <w:rFonts w:ascii="Andale Mono" w:hAnsi="Andale Mono"/>
-          <w:b w:val="false"/>
-          <w:bCs w:val="false"/>
-          <w:i w:val="false"/>
-          <w:iCs w:val="false"/>
-          <w:caps w:val="false"/>
-          <w:smallCaps w:val="false"/>
-          <w:color w:val="24292E"/>
-          <w:spacing w:val="0"/>
-          <w:sz w:val="16"/>
-          <w:szCs w:val="16"/>
-        </w:rPr>
-        <w:t xml:space="preserve">0..9      </w:t>
-      </w:r>
-    </w:p>
-    <w:p>
-      <w:pPr>
-        <w:pStyle w:val="Normal"/>
-        <w:ind w:hanging="0" w:start="0"/>
-        <w:rPr>
-          <w:rFonts w:ascii="Georgia" w:hAnsi="Georgia"/>
-          <w:b w:val="false"/>
-          <w:bCs w:val="false"/>
-          <w:i w:val="false"/>
-          <w:i w:val="false"/>
-          <w:iCs w:val="false"/>
-          <w:caps w:val="false"/>
-          <w:smallCaps w:val="false"/>
-          <w:color w:val="24292E"/>
-          <w:spacing w:val="0"/>
-          <w:sz w:val="16"/>
-          <w:szCs w:val="16"/>
-        </w:rPr>
-      </w:pPr>
-      <w:r>
-        <w:rPr>
-          <w:rFonts w:ascii="Georgia" w:hAnsi="Georgia"/>
-          <w:b w:val="false"/>
-          <w:bCs w:val="false"/>
-          <w:i w:val="false"/>
-          <w:iCs w:val="false"/>
-          <w:caps w:val="false"/>
-          <w:smallCaps w:val="false"/>
-          <w:color w:val="24292E"/>
-          <w:spacing w:val="0"/>
-          <w:sz w:val="16"/>
-          <w:szCs w:val="16"/>
-        </w:rPr>
-      </w:r>
-    </w:p>
-    <w:p>
-      <w:pPr>
-        <w:pStyle w:val="Normal"/>
-        <w:ind w:hanging="0" w:start="0"/>
-        <w:rPr>
-          <w:b w:val="false"/>
-          <w:bCs w:val="false"/>
-        </w:rPr>
-      </w:pPr>
-      <w:r>
-        <w:rPr>
-          <w:rFonts w:ascii="Andale Mono" w:hAnsi="Andale Mono"/>
-          <w:b w:val="false"/>
-          <w:bCs w:val="false"/>
-          <w:i w:val="false"/>
-          <w:iCs w:val="false"/>
-          <w:caps w:val="false"/>
-          <w:smallCaps w:val="false"/>
-          <w:color w:val="24292E"/>
-          <w:spacing w:val="0"/>
-          <w:sz w:val="16"/>
-          <w:szCs w:val="16"/>
-        </w:rPr>
-        <w:t xml:space="preserve"> </w:t>
-      </w:r>
-      <w:r>
-        <w:rPr>
-          <w:rFonts w:ascii="Andale Mono" w:hAnsi="Andale Mono"/>
-          <w:b w:val="false"/>
-          <w:bCs w:val="false"/>
-          <w:i w:val="false"/>
-          <w:iCs w:val="false"/>
-          <w:caps w:val="false"/>
-          <w:smallCaps w:val="false"/>
-          <w:color w:val="24292E"/>
-          <w:spacing w:val="0"/>
-          <w:sz w:val="16"/>
-          <w:szCs w:val="16"/>
-        </w:rPr>
-        <w:t>0x09 #\tab</w:t>
-        <w:tab/>
-      </w:r>
-      <w:r>
-        <w:rPr>
-          <w:rFonts w:ascii="Georgia" w:hAnsi="Georgia"/>
-          <w:b w:val="false"/>
-          <w:bCs w:val="false"/>
-          <w:i w:val="false"/>
-          <w:iCs w:val="false"/>
-          <w:caps w:val="false"/>
-          <w:smallCaps w:val="false"/>
-          <w:color w:val="24292E"/>
-          <w:spacing w:val="0"/>
-          <w:sz w:val="16"/>
-          <w:szCs w:val="16"/>
-        </w:rPr>
-        <w:t>whitespace</w:t>
-      </w:r>
-    </w:p>
-    <w:p>
-      <w:pPr>
-        <w:pStyle w:val="Normal"/>
-        <w:ind w:hanging="0" w:start="0"/>
-        <w:rPr>
-          <w:b w:val="false"/>
-          <w:bCs w:val="false"/>
-        </w:rPr>
-      </w:pPr>
-      <w:r>
-        <w:rPr>
-          <w:rFonts w:ascii="Andale Mono" w:hAnsi="Andale Mono"/>
-          <w:b w:val="false"/>
-          <w:bCs w:val="false"/>
-          <w:i w:val="false"/>
-          <w:iCs w:val="false"/>
-          <w:caps w:val="false"/>
-          <w:smallCaps w:val="false"/>
-          <w:color w:val="24292E"/>
-          <w:spacing w:val="0"/>
-          <w:sz w:val="16"/>
-          <w:szCs w:val="16"/>
-        </w:rPr>
-        <w:t xml:space="preserve"> </w:t>
-      </w:r>
-      <w:r>
-        <w:rPr>
-          <w:rFonts w:ascii="Andale Mono" w:hAnsi="Andale Mono"/>
-          <w:b w:val="false"/>
-          <w:bCs w:val="false"/>
-          <w:i w:val="false"/>
-          <w:iCs w:val="false"/>
-          <w:caps w:val="false"/>
-          <w:smallCaps w:val="false"/>
-          <w:color w:val="24292E"/>
-          <w:spacing w:val="0"/>
-          <w:sz w:val="16"/>
-          <w:szCs w:val="16"/>
-        </w:rPr>
-        <w:t xml:space="preserve">0x0a #\linefeed </w:t>
-      </w:r>
-    </w:p>
-    <w:p>
-      <w:pPr>
-        <w:pStyle w:val="Normal"/>
-        <w:ind w:hanging="0" w:start="0"/>
-        <w:rPr>
-          <w:b w:val="false"/>
-          <w:bCs w:val="false"/>
-        </w:rPr>
-      </w:pPr>
-      <w:r>
-        <w:rPr>
-          <w:rFonts w:ascii="Andale Mono" w:hAnsi="Andale Mono"/>
-          <w:b w:val="false"/>
-          <w:bCs w:val="false"/>
-          <w:i w:val="false"/>
-          <w:iCs w:val="false"/>
-          <w:caps w:val="false"/>
-          <w:smallCaps w:val="false"/>
-          <w:color w:val="24292E"/>
-          <w:spacing w:val="0"/>
-          <w:sz w:val="16"/>
-          <w:szCs w:val="16"/>
-        </w:rPr>
-        <w:t xml:space="preserve"> </w:t>
-      </w:r>
-      <w:r>
-        <w:rPr>
-          <w:rFonts w:ascii="Andale Mono" w:hAnsi="Andale Mono"/>
-          <w:b w:val="false"/>
-          <w:bCs w:val="false"/>
-          <w:i w:val="false"/>
-          <w:iCs w:val="false"/>
-          <w:caps w:val="false"/>
-          <w:smallCaps w:val="false"/>
-          <w:color w:val="24292E"/>
-          <w:spacing w:val="0"/>
-          <w:sz w:val="16"/>
-          <w:szCs w:val="16"/>
-        </w:rPr>
-        <w:t xml:space="preserve">0x0c #\page                </w:t>
-      </w:r>
-    </w:p>
-    <w:p>
-      <w:pPr>
-        <w:pStyle w:val="Normal"/>
-        <w:ind w:hanging="0" w:start="0"/>
-        <w:rPr>
-          <w:b w:val="false"/>
-          <w:bCs w:val="false"/>
-        </w:rPr>
-      </w:pPr>
-      <w:r>
-        <w:rPr>
-          <w:rFonts w:ascii="Andale Mono" w:hAnsi="Andale Mono"/>
-          <w:b w:val="false"/>
-          <w:bCs w:val="false"/>
-          <w:i w:val="false"/>
-          <w:iCs w:val="false"/>
-          <w:caps w:val="false"/>
-          <w:smallCaps w:val="false"/>
-          <w:color w:val="24292E"/>
-          <w:spacing w:val="0"/>
-          <w:sz w:val="16"/>
-          <w:szCs w:val="16"/>
-        </w:rPr>
-        <w:t xml:space="preserve"> </w:t>
-      </w:r>
-      <w:r>
-        <w:rPr>
-          <w:rFonts w:ascii="Andale Mono" w:hAnsi="Andale Mono"/>
-          <w:b w:val="false"/>
-          <w:bCs w:val="false"/>
-          <w:i w:val="false"/>
-          <w:iCs w:val="false"/>
-          <w:caps w:val="false"/>
-          <w:smallCaps w:val="false"/>
-          <w:color w:val="24292E"/>
-          <w:spacing w:val="0"/>
-          <w:sz w:val="16"/>
-          <w:szCs w:val="16"/>
-        </w:rPr>
-        <w:t xml:space="preserve">0x0d #\return            </w:t>
-      </w:r>
-    </w:p>
-    <w:p>
-      <w:pPr>
-        <w:pStyle w:val="Normal"/>
-        <w:ind w:hanging="0" w:start="0"/>
-        <w:rPr>
-          <w:b w:val="false"/>
-          <w:bCs w:val="false"/>
-        </w:rPr>
-      </w:pPr>
-      <w:r>
-        <w:rPr>
-          <w:rFonts w:ascii="Andale Mono" w:hAnsi="Andale Mono"/>
-          <w:b w:val="false"/>
-          <w:bCs w:val="false"/>
-          <w:i w:val="false"/>
-          <w:iCs w:val="false"/>
-          <w:caps w:val="false"/>
-          <w:smallCaps w:val="false"/>
-          <w:color w:val="24292E"/>
-          <w:spacing w:val="0"/>
-          <w:sz w:val="16"/>
-          <w:szCs w:val="16"/>
-        </w:rPr>
-        <w:t xml:space="preserve"> </w:t>
-      </w:r>
-      <w:r>
-        <w:rPr>
-          <w:rFonts w:ascii="Andale Mono" w:hAnsi="Andale Mono"/>
+        <w:t xml:space="preserve"> </w:t>
+      </w:r>
+      <w:r>
+        <w:rPr>
+          <w:rFonts w:ascii="Andale Mono MT Std" w:hAnsi="Andale Mono MT Std"/>
           <w:b w:val="false"/>
           <w:bCs w:val="false"/>
           <w:i w:val="false"/>
@@ -15346,12 +15009,12 @@
       <w:numFmt w:val="none"/>
       <w:suff w:val="nothing"/>
       <w:lvlText w:val=""/>
-      <w:lvlJc w:val="start"/>
+      <w:lvlJc w:val="left"/>
       <w:pPr>
         <w:tabs>
           <w:tab w:val="num" w:pos="0"/>
         </w:tabs>
-        <w:ind w:start="0" w:hanging="0"/>
+        <w:ind w:left="0" w:hanging="0"/>
       </w:pPr>
       <w:rPr/>
     </w:lvl>
@@ -15360,12 +15023,12 @@
       <w:numFmt w:val="none"/>
       <w:suff w:val="nothing"/>
       <w:lvlText w:val=""/>
-      <w:lvlJc w:val="start"/>
+      <w:lvlJc w:val="left"/>
       <w:pPr>
         <w:tabs>
           <w:tab w:val="num" w:pos="0"/>
         </w:tabs>
-        <w:ind w:start="0" w:hanging="0"/>
+        <w:ind w:left="0" w:hanging="0"/>
       </w:pPr>
       <w:rPr/>
     </w:lvl>
@@ -15374,12 +15037,12 @@
       <w:numFmt w:val="none"/>
       <w:suff w:val="nothing"/>
       <w:lvlText w:val=""/>
-      <w:lvlJc w:val="start"/>
+      <w:lvlJc w:val="left"/>
       <w:pPr>
         <w:tabs>
           <w:tab w:val="num" w:pos="0"/>
         </w:tabs>
-        <w:ind w:start="0" w:hanging="0"/>
+        <w:ind w:left="0" w:hanging="0"/>
       </w:pPr>
       <w:rPr/>
     </w:lvl>
@@ -15388,12 +15051,12 @@
       <w:numFmt w:val="none"/>
       <w:suff w:val="nothing"/>
       <w:lvlText w:val=""/>
-      <w:lvlJc w:val="start"/>
+      <w:lvlJc w:val="left"/>
       <w:pPr>
         <w:tabs>
           <w:tab w:val="num" w:pos="0"/>
         </w:tabs>
-        <w:ind w:start="0" w:hanging="0"/>
+        <w:ind w:left="0" w:hanging="0"/>
       </w:pPr>
       <w:rPr/>
     </w:lvl>
@@ -15402,12 +15065,12 @@
       <w:numFmt w:val="none"/>
       <w:suff w:val="nothing"/>
       <w:lvlText w:val=""/>
-      <w:lvlJc w:val="start"/>
+      <w:lvlJc w:val="left"/>
       <w:pPr>
         <w:tabs>
           <w:tab w:val="num" w:pos="0"/>
         </w:tabs>
-        <w:ind w:start="0" w:hanging="0"/>
+        <w:ind w:left="0" w:hanging="0"/>
       </w:pPr>
       <w:rPr/>
     </w:lvl>
@@ -15416,12 +15079,12 @@
       <w:numFmt w:val="none"/>
       <w:suff w:val="nothing"/>
       <w:lvlText w:val=""/>
-      <w:lvlJc w:val="start"/>
+      <w:lvlJc w:val="left"/>
       <w:pPr>
         <w:tabs>
           <w:tab w:val="num" w:pos="0"/>
         </w:tabs>
-        <w:ind w:start="0" w:hanging="0"/>
+        <w:ind w:left="0" w:hanging="0"/>
       </w:pPr>
       <w:rPr/>
     </w:lvl>
@@ -15430,12 +15093,12 @@
       <w:numFmt w:val="none"/>
       <w:suff w:val="nothing"/>
       <w:lvlText w:val=""/>
-      <w:lvlJc w:val="start"/>
+      <w:lvlJc w:val="left"/>
       <w:pPr>
         <w:tabs>
           <w:tab w:val="num" w:pos="0"/>
         </w:tabs>
-        <w:ind w:start="0" w:hanging="0"/>
+        <w:ind w:left="0" w:hanging="0"/>
       </w:pPr>
       <w:rPr/>
     </w:lvl>
@@ -15444,12 +15107,12 @@
       <w:numFmt w:val="none"/>
       <w:suff w:val="nothing"/>
       <w:lvlText w:val=""/>
-      <w:lvlJc w:val="start"/>
+      <w:lvlJc w:val="left"/>
       <w:pPr>
         <w:tabs>
           <w:tab w:val="num" w:pos="0"/>
         </w:tabs>
-        <w:ind w:start="0" w:hanging="0"/>
+        <w:ind w:left="0" w:hanging="0"/>
       </w:pPr>
       <w:rPr/>
     </w:lvl>
@@ -15458,12 +15121,12 @@
       <w:numFmt w:val="none"/>
       <w:suff w:val="nothing"/>
       <w:lvlText w:val=""/>
-      <w:lvlJc w:val="start"/>
+      <w:lvlJc w:val="left"/>
       <w:pPr>
         <w:tabs>
           <w:tab w:val="num" w:pos="0"/>
         </w:tabs>
-        <w:ind w:start="0" w:hanging="0"/>
+        <w:ind w:left="0" w:hanging="0"/>
       </w:pPr>
       <w:rPr/>
     </w:lvl>
@@ -15474,12 +15137,12 @@
       <w:numFmt w:val="none"/>
       <w:suff w:val="nothing"/>
       <w:lvlText w:val=""/>
-      <w:lvlJc w:val="start"/>
+      <w:lvlJc w:val="left"/>
       <w:pPr>
         <w:tabs>
           <w:tab w:val="num" w:pos="0"/>
         </w:tabs>
-        <w:ind w:start="0" w:hanging="0"/>
+        <w:ind w:left="0" w:hanging="0"/>
       </w:pPr>
     </w:lvl>
     <w:lvl w:ilvl="1">
@@ -15487,12 +15150,12 @@
       <w:numFmt w:val="none"/>
       <w:suff w:val="nothing"/>
       <w:lvlText w:val=""/>
-      <w:lvlJc w:val="start"/>
+      <w:lvlJc w:val="left"/>
       <w:pPr>
         <w:tabs>
           <w:tab w:val="num" w:pos="0"/>
         </w:tabs>
-        <w:ind w:start="0" w:hanging="0"/>
+        <w:ind w:left="0" w:hanging="0"/>
       </w:pPr>
     </w:lvl>
     <w:lvl w:ilvl="2">
@@ -15500,12 +15163,12 @@
       <w:numFmt w:val="none"/>
       <w:suff w:val="nothing"/>
       <w:lvlText w:val=""/>
-      <w:lvlJc w:val="start"/>
+      <w:lvlJc w:val="left"/>
       <w:pPr>
         <w:tabs>
           <w:tab w:val="num" w:pos="0"/>
         </w:tabs>
-        <w:ind w:start="0" w:hanging="0"/>
+        <w:ind w:left="0" w:hanging="0"/>
       </w:pPr>
     </w:lvl>
     <w:lvl w:ilvl="3">
@@ -15513,12 +15176,12 @@
       <w:numFmt w:val="none"/>
       <w:suff w:val="nothing"/>
       <w:lvlText w:val=""/>
-      <w:lvlJc w:val="start"/>
+      <w:lvlJc w:val="left"/>
       <w:pPr>
         <w:tabs>
           <w:tab w:val="num" w:pos="0"/>
         </w:tabs>
-        <w:ind w:start="0" w:hanging="0"/>
+        <w:ind w:left="0" w:hanging="0"/>
       </w:pPr>
     </w:lvl>
     <w:lvl w:ilvl="4">
@@ -15526,12 +15189,12 @@
       <w:numFmt w:val="none"/>
       <w:suff w:val="nothing"/>
       <w:lvlText w:val=""/>
-      <w:lvlJc w:val="start"/>
+      <w:lvlJc w:val="left"/>
       <w:pPr>
         <w:tabs>
           <w:tab w:val="num" w:pos="0"/>
         </w:tabs>
-        <w:ind w:start="0" w:hanging="0"/>
+        <w:ind w:left="0" w:hanging="0"/>
       </w:pPr>
     </w:lvl>
     <w:lvl w:ilvl="5">
@@ -15539,12 +15202,12 @@
       <w:numFmt w:val="none"/>
       <w:suff w:val="nothing"/>
       <w:lvlText w:val=""/>
-      <w:lvlJc w:val="start"/>
+      <w:lvlJc w:val="left"/>
       <w:pPr>
         <w:tabs>
           <w:tab w:val="num" w:pos="0"/>
         </w:tabs>
-        <w:ind w:start="0" w:hanging="0"/>
+        <w:ind w:left="0" w:hanging="0"/>
       </w:pPr>
     </w:lvl>
     <w:lvl w:ilvl="6">
@@ -15552,12 +15215,12 @@
       <w:numFmt w:val="none"/>
       <w:suff w:val="nothing"/>
       <w:lvlText w:val=""/>
-      <w:lvlJc w:val="start"/>
+      <w:lvlJc w:val="left"/>
       <w:pPr>
         <w:tabs>
           <w:tab w:val="num" w:pos="0"/>
         </w:tabs>
-        <w:ind w:start="0" w:hanging="0"/>
+        <w:ind w:left="0" w:hanging="0"/>
       </w:pPr>
     </w:lvl>
     <w:lvl w:ilvl="7">
@@ -15565,12 +15228,12 @@
       <w:numFmt w:val="none"/>
       <w:suff w:val="nothing"/>
       <w:lvlText w:val=""/>
-      <w:lvlJc w:val="start"/>
+      <w:lvlJc w:val="left"/>
       <w:pPr>
         <w:tabs>
           <w:tab w:val="num" w:pos="0"/>
         </w:tabs>
-        <w:ind w:start="0" w:hanging="0"/>
+        <w:ind w:left="0" w:hanging="0"/>
       </w:pPr>
     </w:lvl>
     <w:lvl w:ilvl="8">
@@ -15578,12 +15241,12 @@
       <w:numFmt w:val="none"/>
       <w:suff w:val="nothing"/>
       <w:lvlText w:val=""/>
-      <w:lvlJc w:val="start"/>
+      <w:lvlJc w:val="left"/>
       <w:pPr>
         <w:tabs>
           <w:tab w:val="num" w:pos="0"/>
         </w:tabs>
-        <w:ind w:start="0" w:hanging="0"/>
+        <w:ind w:left="0" w:hanging="0"/>
       </w:pPr>
     </w:lvl>
   </w:abstractNum>
@@ -15619,10 +15282,10 @@
     <w:pPr>
       <w:widowControl/>
       <w:suppressAutoHyphens w:val="true"/>
-      <w:overflowPunct w:val="false"/>
+      <w:overflowPunct w:val="true"/>
       <w:bidi w:val="0"/>
       <w:spacing w:before="0" w:after="0"/>
-      <w:jc w:val="start"/>
+      <w:jc w:val="left"/>
     </w:pPr>
     <w:rPr>
       <w:rFonts w:ascii="Liberation Serif" w:hAnsi="Liberation Serif" w:eastAsia="Songti SC" w:cs="Arial Unicode MS"/>
@@ -15634,7 +15297,7 @@
     </w:rPr>
   </w:style>
   <w:style w:type="paragraph" w:styleId="Heading1">
-    <w:name w:val="Heading 1"/>
+    <w:name w:val="heading 1"/>
     <w:basedOn w:val="Heading"/>
     <w:next w:val="BodyText"/>
     <w:qFormat/>
@@ -15697,7 +15360,7 @@
     </w:rPr>
   </w:style>
   <w:style w:type="paragraph" w:styleId="Caption">
-    <w:name w:val="Caption"/>
+    <w:name w:val="caption"/>
     <w:basedOn w:val="Normal"/>
     <w:qFormat/>
     <w:pPr>
@@ -15778,7 +15441,7 @@
     <w:rPr/>
   </w:style>
   <w:style w:type="paragraph" w:styleId="Header">
-    <w:name w:val="Header"/>
+    <w:name w:val="header"/>
     <w:basedOn w:val="HeaderandFooter"/>
     <w:pPr>
       <w:suppressLineNumbers/>
@@ -15796,37 +15459,37 @@
         <a:srgbClr val="000000"/>
       </a:dk1>
       <a:lt1>
-        <a:srgbClr val="ffffff"/>
+        <a:srgbClr val="FFFFFF"/>
       </a:lt1>
       <a:dk2>
         <a:srgbClr val="000000"/>
       </a:dk2>
       <a:lt2>
-        <a:srgbClr val="ffffff"/>
+        <a:srgbClr val="FFFFFF"/>
       </a:lt2>
       <a:accent1>
-        <a:srgbClr val="18a303"/>
+        <a:srgbClr val="18A303"/>
       </a:accent1>
       <a:accent2>
-        <a:srgbClr val="0369a3"/>
+        <a:srgbClr val="0369A3"/>
       </a:accent2>
       <a:accent3>
-        <a:srgbClr val="a33e03"/>
+        <a:srgbClr val="A33E03"/>
       </a:accent3>
       <a:accent4>
-        <a:srgbClr val="8e03a3"/>
+        <a:srgbClr val="8E03A3"/>
       </a:accent4>
       <a:accent5>
-        <a:srgbClr val="c99c00"/>
+        <a:srgbClr val="C99C00"/>
       </a:accent5>
       <a:accent6>
-        <a:srgbClr val="c9211e"/>
+        <a:srgbClr val="C9211E"/>
       </a:accent6>
       <a:hlink>
-        <a:srgbClr val="0000ee"/>
+        <a:srgbClr val="0000EE"/>
       </a:hlink>
       <a:folHlink>
-        <a:srgbClr val="551a8b"/>
+        <a:srgbClr val="551A8B"/>
       </a:folHlink>
     </a:clrScheme>
     <a:fontScheme name="Office">

</xml_diff>